<commit_message>
Update master research file with Phase 4 corporate layer data
</commit_message>
<xml_diff>
--- a/reference/visa/Visa_Incentive_Machine_Master_Research.docx
+++ b/reference/visa/Visa_Incentive_Machine_Master_Research.docx
@@ -7623,6 +7623,3127 @@
     </w:p>
     <w:p>
       <w:pPr>
+        <w:pStyle w:val="Heading2"/>
+      </w:pPr>
+      <w:r>
+        <w:t>09-A — BIG THREE OWNERSHIP: TOP H-1B SPONSORS (CONFIRMED Q4 2025)</w:t>
+      </w:r>
+    </w:p>
+    <w:p>
+      <w:r>
+        <w:rPr>
+          <w:b w:val="0"/>
+        </w:rPr>
+        <w:t>Ownership percentages confirmed from Q4 2025 SEC 13F filings, aggregated via Yahoo Finance, Wall Street Zen, and Investing.com. Cross-verified across multiple aggregators.</w:t>
+      </w:r>
+    </w:p>
+    <w:tbl>
+      <w:tblPr>
+        <w:tblStyle w:val="TableGrid"/>
+        <w:tblW w:type="auto" w:w="0"/>
+        <w:tblLook w:firstColumn="1" w:firstRow="1" w:lastColumn="0" w:lastRow="0" w:noHBand="0" w:noVBand="1" w:val="04A0"/>
+      </w:tblPr>
+      <w:tblGrid>
+        <w:gridCol w:w="1728"/>
+        <w:gridCol w:w="1728"/>
+        <w:gridCol w:w="1728"/>
+        <w:gridCol w:w="1728"/>
+        <w:gridCol w:w="1728"/>
+      </w:tblGrid>
+      <w:tr>
+        <w:tc>
+          <w:tcPr>
+            <w:tcW w:type="dxa" w:w="1728"/>
+          </w:tcPr>
+          <w:p>
+            <w:r>
+              <w:rPr>
+                <w:b/>
+              </w:rPr>
+              <w:t>Company</w:t>
+            </w:r>
+          </w:p>
+        </w:tc>
+        <w:tc>
+          <w:tcPr>
+            <w:tcW w:type="dxa" w:w="1728"/>
+          </w:tcPr>
+          <w:p>
+            <w:r>
+              <w:rPr>
+                <w:b/>
+              </w:rPr>
+              <w:t>Vanguard</w:t>
+            </w:r>
+          </w:p>
+        </w:tc>
+        <w:tc>
+          <w:tcPr>
+            <w:tcW w:type="dxa" w:w="1728"/>
+          </w:tcPr>
+          <w:p>
+            <w:r>
+              <w:rPr>
+                <w:b/>
+              </w:rPr>
+              <w:t>BlackRock</w:t>
+            </w:r>
+          </w:p>
+        </w:tc>
+        <w:tc>
+          <w:tcPr>
+            <w:tcW w:type="dxa" w:w="1728"/>
+          </w:tcPr>
+          <w:p>
+            <w:r>
+              <w:rPr>
+                <w:b/>
+              </w:rPr>
+              <w:t>State Street</w:t>
+            </w:r>
+          </w:p>
+        </w:tc>
+        <w:tc>
+          <w:tcPr>
+            <w:tcW w:type="dxa" w:w="1728"/>
+          </w:tcPr>
+          <w:p>
+            <w:r>
+              <w:rPr>
+                <w:b/>
+              </w:rPr>
+              <w:t>Primary Source</w:t>
+            </w:r>
+          </w:p>
+        </w:tc>
+      </w:tr>
+      <w:tr>
+        <w:tc>
+          <w:tcPr>
+            <w:tcW w:type="dxa" w:w="1728"/>
+          </w:tcPr>
+          <w:p>
+            <w:r>
+              <w:t>Amazon (AMZN)</w:t>
+            </w:r>
+          </w:p>
+        </w:tc>
+        <w:tc>
+          <w:tcPr>
+            <w:tcW w:type="dxa" w:w="1728"/>
+          </w:tcPr>
+          <w:p>
+            <w:r>
+              <w:t>7.86%</w:t>
+            </w:r>
+          </w:p>
+        </w:tc>
+        <w:tc>
+          <w:tcPr>
+            <w:tcW w:type="dxa" w:w="1728"/>
+          </w:tcPr>
+          <w:p>
+            <w:r>
+              <w:t>6.83%</w:t>
+            </w:r>
+          </w:p>
+        </w:tc>
+        <w:tc>
+          <w:tcPr>
+            <w:tcW w:type="dxa" w:w="1728"/>
+          </w:tcPr>
+          <w:p>
+            <w:r>
+              <w:t>3.61%</w:t>
+            </w:r>
+          </w:p>
+        </w:tc>
+        <w:tc>
+          <w:tcPr>
+            <w:tcW w:type="dxa" w:w="1728"/>
+          </w:tcPr>
+          <w:p>
+            <w:r>
+              <w:t>finance.yahoo.com/quote/AMZN/holders</w:t>
+            </w:r>
+          </w:p>
+        </w:tc>
+      </w:tr>
+      <w:tr>
+        <w:tc>
+          <w:tcPr>
+            <w:tcW w:type="dxa" w:w="1728"/>
+          </w:tcPr>
+          <w:p>
+            <w:r>
+              <w:t>Meta (META)</w:t>
+            </w:r>
+          </w:p>
+        </w:tc>
+        <w:tc>
+          <w:tcPr>
+            <w:tcW w:type="dxa" w:w="1728"/>
+          </w:tcPr>
+          <w:p>
+            <w:r>
+              <w:t>7.91%</w:t>
+            </w:r>
+          </w:p>
+        </w:tc>
+        <w:tc>
+          <w:tcPr>
+            <w:tcW w:type="dxa" w:w="1728"/>
+          </w:tcPr>
+          <w:p>
+            <w:r>
+              <w:t>6.78%</w:t>
+            </w:r>
+          </w:p>
+        </w:tc>
+        <w:tc>
+          <w:tcPr>
+            <w:tcW w:type="dxa" w:w="1728"/>
+          </w:tcPr>
+          <w:p>
+            <w:r>
+              <w:t>3.59%</w:t>
+            </w:r>
+          </w:p>
+        </w:tc>
+        <w:tc>
+          <w:tcPr>
+            <w:tcW w:type="dxa" w:w="1728"/>
+          </w:tcPr>
+          <w:p>
+            <w:r>
+              <w:t>wallstreetzen.com/stocks/us/nasdaq/meta/ownership</w:t>
+            </w:r>
+          </w:p>
+        </w:tc>
+      </w:tr>
+      <w:tr>
+        <w:tc>
+          <w:tcPr>
+            <w:tcW w:type="dxa" w:w="1728"/>
+          </w:tcPr>
+          <w:p>
+            <w:r>
+              <w:t>Microsoft (MSFT)</w:t>
+            </w:r>
+          </w:p>
+        </w:tc>
+        <w:tc>
+          <w:tcPr>
+            <w:tcW w:type="dxa" w:w="1728"/>
+          </w:tcPr>
+          <w:p>
+            <w:r>
+              <w:t>9.67%</w:t>
+            </w:r>
+          </w:p>
+        </w:tc>
+        <w:tc>
+          <w:tcPr>
+            <w:tcW w:type="dxa" w:w="1728"/>
+          </w:tcPr>
+          <w:p>
+            <w:r>
+              <w:t>8.11%</w:t>
+            </w:r>
+          </w:p>
+        </w:tc>
+        <w:tc>
+          <w:tcPr>
+            <w:tcW w:type="dxa" w:w="1728"/>
+          </w:tcPr>
+          <w:p>
+            <w:r>
+              <w:t>4.12%</w:t>
+            </w:r>
+          </w:p>
+        </w:tc>
+        <w:tc>
+          <w:tcPr>
+            <w:tcW w:type="dxa" w:w="1728"/>
+          </w:tcPr>
+          <w:p>
+            <w:r>
+              <w:t>finance.yahoo.com/quote/MSFT/holders</w:t>
+            </w:r>
+          </w:p>
+        </w:tc>
+      </w:tr>
+      <w:tr>
+        <w:tc>
+          <w:tcPr>
+            <w:tcW w:type="dxa" w:w="1728"/>
+          </w:tcPr>
+          <w:p>
+            <w:r>
+              <w:t>Google/Alphabet (GOOG)</w:t>
+            </w:r>
+          </w:p>
+        </w:tc>
+        <w:tc>
+          <w:tcPr>
+            <w:tcW w:type="dxa" w:w="1728"/>
+          </w:tcPr>
+          <w:p>
+            <w:r>
+              <w:t>7.74%</w:t>
+            </w:r>
+          </w:p>
+        </w:tc>
+        <w:tc>
+          <w:tcPr>
+            <w:tcW w:type="dxa" w:w="1728"/>
+          </w:tcPr>
+          <w:p>
+            <w:r>
+              <w:t>6.64%</w:t>
+            </w:r>
+          </w:p>
+        </w:tc>
+        <w:tc>
+          <w:tcPr>
+            <w:tcW w:type="dxa" w:w="1728"/>
+          </w:tcPr>
+          <w:p>
+            <w:r>
+              <w:t>3.44%</w:t>
+            </w:r>
+          </w:p>
+        </w:tc>
+        <w:tc>
+          <w:tcPr>
+            <w:tcW w:type="dxa" w:w="1728"/>
+          </w:tcPr>
+          <w:p>
+            <w:r>
+              <w:t>finance.yahoo.com/quote/GOOG/holders</w:t>
+            </w:r>
+          </w:p>
+        </w:tc>
+      </w:tr>
+      <w:tr>
+        <w:tc>
+          <w:tcPr>
+            <w:tcW w:type="dxa" w:w="1728"/>
+          </w:tcPr>
+          <w:p>
+            <w:r>
+              <w:t>TCS (TCS.NS)</w:t>
+            </w:r>
+          </w:p>
+        </w:tc>
+        <w:tc>
+          <w:tcPr>
+            <w:tcW w:type="dxa" w:w="1728"/>
+          </w:tcPr>
+          <w:p>
+            <w:r>
+              <w:t>0.77%</w:t>
+            </w:r>
+          </w:p>
+        </w:tc>
+        <w:tc>
+          <w:tcPr>
+            <w:tcW w:type="dxa" w:w="1728"/>
+          </w:tcPr>
+          <w:p>
+            <w:r>
+              <w:t>1.04%</w:t>
+            </w:r>
+          </w:p>
+        </w:tc>
+        <w:tc>
+          <w:tcPr>
+            <w:tcW w:type="dxa" w:w="1728"/>
+          </w:tcPr>
+          <w:p>
+            <w:r>
+              <w:t>&lt;0.5%</w:t>
+            </w:r>
+          </w:p>
+        </w:tc>
+        <w:tc>
+          <w:tcPr>
+            <w:tcW w:type="dxa" w:w="1728"/>
+          </w:tcPr>
+          <w:p>
+            <w:r>
+              <w:t>investing.com/equities/tata-consultancy-services-ownership</w:t>
+            </w:r>
+          </w:p>
+        </w:tc>
+      </w:tr>
+    </w:tbl>
+    <w:p>
+      <w:r>
+        <w:rPr>
+          <w:b w:val="0"/>
+        </w:rPr>
+        <w:t>TCS is majority-owned by Tata Sons (~71.77% promoter stake). Big Three hold far smaller stakes than in U.S.-listed sponsors. The ownership loop is significantly tighter for Amazon/Meta/Microsoft/Google.</w:t>
+      </w:r>
+    </w:p>
+    <w:p>
+      <w:pPr>
+        <w:pStyle w:val="Heading2"/>
+      </w:pPr>
+      <w:r>
+        <w:t>09-B — BIG THREE OWNERSHIP: TCS END-CLIENT COMPANIES</w:t>
+      </w:r>
+    </w:p>
+    <w:p>
+      <w:r>
+        <w:rPr>
+          <w:b w:val="0"/>
+        </w:rPr>
+        <w:t>TCS and similar outsourcing firms deploy H-1B workers to third-party end-clients under service contracts. The Big Three own both the outsourcers AND their end clients. Largest documented TCS end-client: Citigroup (~3,000 new H-1B contractors placed 2020–2024). Source: bloomberg.com/graphics/2025-h1b-visa-middlemen-cheap-labor-for-us-banks</w:t>
+      </w:r>
+    </w:p>
+    <w:tbl>
+      <w:tblPr>
+        <w:tblStyle w:val="TableGrid"/>
+        <w:tblW w:type="auto" w:w="0"/>
+        <w:tblLook w:firstColumn="1" w:firstRow="1" w:lastColumn="0" w:lastRow="0" w:noHBand="0" w:noVBand="1" w:val="04A0"/>
+      </w:tblPr>
+      <w:tblGrid>
+        <w:gridCol w:w="1728"/>
+        <w:gridCol w:w="1728"/>
+        <w:gridCol w:w="1728"/>
+        <w:gridCol w:w="1728"/>
+        <w:gridCol w:w="1728"/>
+      </w:tblGrid>
+      <w:tr>
+        <w:tc>
+          <w:tcPr>
+            <w:tcW w:type="dxa" w:w="1728"/>
+          </w:tcPr>
+          <w:p>
+            <w:r>
+              <w:rPr>
+                <w:b/>
+              </w:rPr>
+              <w:t>End Client</w:t>
+            </w:r>
+          </w:p>
+        </w:tc>
+        <w:tc>
+          <w:tcPr>
+            <w:tcW w:type="dxa" w:w="1728"/>
+          </w:tcPr>
+          <w:p>
+            <w:r>
+              <w:rPr>
+                <w:b/>
+              </w:rPr>
+              <w:t>Vanguard</w:t>
+            </w:r>
+          </w:p>
+        </w:tc>
+        <w:tc>
+          <w:tcPr>
+            <w:tcW w:type="dxa" w:w="1728"/>
+          </w:tcPr>
+          <w:p>
+            <w:r>
+              <w:rPr>
+                <w:b/>
+              </w:rPr>
+              <w:t>BlackRock</w:t>
+            </w:r>
+          </w:p>
+        </w:tc>
+        <w:tc>
+          <w:tcPr>
+            <w:tcW w:type="dxa" w:w="1728"/>
+          </w:tcPr>
+          <w:p>
+            <w:r>
+              <w:rPr>
+                <w:b/>
+              </w:rPr>
+              <w:t>State Street</w:t>
+            </w:r>
+          </w:p>
+        </w:tc>
+        <w:tc>
+          <w:tcPr>
+            <w:tcW w:type="dxa" w:w="1728"/>
+          </w:tcPr>
+          <w:p>
+            <w:r>
+              <w:rPr>
+                <w:b/>
+              </w:rPr>
+              <w:t>Source</w:t>
+            </w:r>
+          </w:p>
+        </w:tc>
+      </w:tr>
+      <w:tr>
+        <w:tc>
+          <w:tcPr>
+            <w:tcW w:type="dxa" w:w="1728"/>
+          </w:tcPr>
+          <w:p>
+            <w:r>
+              <w:t>Citigroup (C)</w:t>
+            </w:r>
+          </w:p>
+        </w:tc>
+        <w:tc>
+          <w:tcPr>
+            <w:tcW w:type="dxa" w:w="1728"/>
+          </w:tcPr>
+          <w:p>
+            <w:r>
+              <w:t>8.9%</w:t>
+            </w:r>
+          </w:p>
+        </w:tc>
+        <w:tc>
+          <w:tcPr>
+            <w:tcW w:type="dxa" w:w="1728"/>
+          </w:tcPr>
+          <w:p>
+            <w:r>
+              <w:t>7.2%</w:t>
+            </w:r>
+          </w:p>
+        </w:tc>
+        <w:tc>
+          <w:tcPr>
+            <w:tcW w:type="dxa" w:w="1728"/>
+          </w:tcPr>
+          <w:p>
+            <w:r>
+              <w:t>4.3%</w:t>
+            </w:r>
+          </w:p>
+        </w:tc>
+        <w:tc>
+          <w:tcPr>
+            <w:tcW w:type="dxa" w:w="1728"/>
+          </w:tcPr>
+          <w:p>
+            <w:r>
+              <w:t>finance.yahoo.com/quote/C/holders</w:t>
+            </w:r>
+          </w:p>
+        </w:tc>
+      </w:tr>
+      <w:tr>
+        <w:tc>
+          <w:tcPr>
+            <w:tcW w:type="dxa" w:w="1728"/>
+          </w:tcPr>
+          <w:p>
+            <w:r>
+              <w:t>JPMorgan Chase (JPM)</w:t>
+            </w:r>
+          </w:p>
+        </w:tc>
+        <w:tc>
+          <w:tcPr>
+            <w:tcW w:type="dxa" w:w="1728"/>
+          </w:tcPr>
+          <w:p>
+            <w:r>
+              <w:t>9.91%</w:t>
+            </w:r>
+          </w:p>
+        </w:tc>
+        <w:tc>
+          <w:tcPr>
+            <w:tcW w:type="dxa" w:w="1728"/>
+          </w:tcPr>
+          <w:p>
+            <w:r>
+              <w:t>7.89%</w:t>
+            </w:r>
+          </w:p>
+        </w:tc>
+        <w:tc>
+          <w:tcPr>
+            <w:tcW w:type="dxa" w:w="1728"/>
+          </w:tcPr>
+          <w:p>
+            <w:r>
+              <w:t>4.67%</w:t>
+            </w:r>
+          </w:p>
+        </w:tc>
+        <w:tc>
+          <w:tcPr>
+            <w:tcW w:type="dxa" w:w="1728"/>
+          </w:tcPr>
+          <w:p>
+            <w:r>
+              <w:t>finance.yahoo.com/quote/JPM/holders</w:t>
+            </w:r>
+          </w:p>
+        </w:tc>
+      </w:tr>
+      <w:tr>
+        <w:tc>
+          <w:tcPr>
+            <w:tcW w:type="dxa" w:w="1728"/>
+          </w:tcPr>
+          <w:p>
+            <w:r>
+              <w:t>Wells Fargo (WFC)</w:t>
+            </w:r>
+          </w:p>
+        </w:tc>
+        <w:tc>
+          <w:tcPr>
+            <w:tcW w:type="dxa" w:w="1728"/>
+          </w:tcPr>
+          <w:p>
+            <w:r>
+              <w:t>9.61%</w:t>
+            </w:r>
+          </w:p>
+        </w:tc>
+        <w:tc>
+          <w:tcPr>
+            <w:tcW w:type="dxa" w:w="1728"/>
+          </w:tcPr>
+          <w:p>
+            <w:r>
+              <w:t>8.50%</w:t>
+            </w:r>
+          </w:p>
+        </w:tc>
+        <w:tc>
+          <w:tcPr>
+            <w:tcW w:type="dxa" w:w="1728"/>
+          </w:tcPr>
+          <w:p>
+            <w:r>
+              <w:t>4.44%</w:t>
+            </w:r>
+          </w:p>
+        </w:tc>
+        <w:tc>
+          <w:tcPr>
+            <w:tcW w:type="dxa" w:w="1728"/>
+          </w:tcPr>
+          <w:p>
+            <w:r>
+              <w:t>finance.yahoo.com/quote/WFC/holders</w:t>
+            </w:r>
+          </w:p>
+        </w:tc>
+      </w:tr>
+      <w:tr>
+        <w:tc>
+          <w:tcPr>
+            <w:tcW w:type="dxa" w:w="1728"/>
+          </w:tcPr>
+          <w:p>
+            <w:r>
+              <w:t>Goldman Sachs (GS)</w:t>
+            </w:r>
+          </w:p>
+        </w:tc>
+        <w:tc>
+          <w:tcPr>
+            <w:tcW w:type="dxa" w:w="1728"/>
+          </w:tcPr>
+          <w:p>
+            <w:r>
+              <w:t>9.84%</w:t>
+            </w:r>
+          </w:p>
+        </w:tc>
+        <w:tc>
+          <w:tcPr>
+            <w:tcW w:type="dxa" w:w="1728"/>
+          </w:tcPr>
+          <w:p>
+            <w:r>
+              <w:t>7.88%</w:t>
+            </w:r>
+          </w:p>
+        </w:tc>
+        <w:tc>
+          <w:tcPr>
+            <w:tcW w:type="dxa" w:w="1728"/>
+          </w:tcPr>
+          <w:p>
+            <w:r>
+              <w:t>6.63%</w:t>
+            </w:r>
+          </w:p>
+        </w:tc>
+        <w:tc>
+          <w:tcPr>
+            <w:tcW w:type="dxa" w:w="1728"/>
+          </w:tcPr>
+          <w:p>
+            <w:r>
+              <w:t>finance.yahoo.com/quote/GS/holders</w:t>
+            </w:r>
+          </w:p>
+        </w:tc>
+      </w:tr>
+      <w:tr>
+        <w:tc>
+          <w:tcPr>
+            <w:tcW w:type="dxa" w:w="1728"/>
+          </w:tcPr>
+          <w:p>
+            <w:r>
+              <w:t>Capital One (COF)</w:t>
+            </w:r>
+          </w:p>
+        </w:tc>
+        <w:tc>
+          <w:tcPr>
+            <w:tcW w:type="dxa" w:w="1728"/>
+          </w:tcPr>
+          <w:p>
+            <w:r>
+              <w:t>9.15%</w:t>
+            </w:r>
+          </w:p>
+        </w:tc>
+        <w:tc>
+          <w:tcPr>
+            <w:tcW w:type="dxa" w:w="1728"/>
+          </w:tcPr>
+          <w:p>
+            <w:r>
+              <w:t>8.20%</w:t>
+            </w:r>
+          </w:p>
+        </w:tc>
+        <w:tc>
+          <w:tcPr>
+            <w:tcW w:type="dxa" w:w="1728"/>
+          </w:tcPr>
+          <w:p>
+            <w:r>
+              <w:t>4.48%</w:t>
+            </w:r>
+          </w:p>
+        </w:tc>
+        <w:tc>
+          <w:tcPr>
+            <w:tcW w:type="dxa" w:w="1728"/>
+          </w:tcPr>
+          <w:p>
+            <w:r>
+              <w:t>finance.yahoo.com/quote/COF/holders</w:t>
+            </w:r>
+          </w:p>
+        </w:tc>
+      </w:tr>
+      <w:tr>
+        <w:tc>
+          <w:tcPr>
+            <w:tcW w:type="dxa" w:w="1728"/>
+          </w:tcPr>
+          <w:p>
+            <w:r>
+              <w:t>Verizon (VZ)</w:t>
+            </w:r>
+          </w:p>
+        </w:tc>
+        <w:tc>
+          <w:tcPr>
+            <w:tcW w:type="dxa" w:w="1728"/>
+          </w:tcPr>
+          <w:p>
+            <w:r>
+              <w:t>9.08%</w:t>
+            </w:r>
+          </w:p>
+        </w:tc>
+        <w:tc>
+          <w:tcPr>
+            <w:tcW w:type="dxa" w:w="1728"/>
+          </w:tcPr>
+          <w:p>
+            <w:r>
+              <w:t>8.83%</w:t>
+            </w:r>
+          </w:p>
+        </w:tc>
+        <w:tc>
+          <w:tcPr>
+            <w:tcW w:type="dxa" w:w="1728"/>
+          </w:tcPr>
+          <w:p>
+            <w:r>
+              <w:t>5.33%</w:t>
+            </w:r>
+          </w:p>
+        </w:tc>
+        <w:tc>
+          <w:tcPr>
+            <w:tcW w:type="dxa" w:w="1728"/>
+          </w:tcPr>
+          <w:p>
+            <w:r>
+              <w:t>finance.yahoo.com/quote/VZ/holders</w:t>
+            </w:r>
+          </w:p>
+        </w:tc>
+      </w:tr>
+      <w:tr>
+        <w:tc>
+          <w:tcPr>
+            <w:tcW w:type="dxa" w:w="1728"/>
+          </w:tcPr>
+          <w:p>
+            <w:r>
+              <w:t>AT&amp;T (T)</w:t>
+            </w:r>
+          </w:p>
+        </w:tc>
+        <w:tc>
+          <w:tcPr>
+            <w:tcW w:type="dxa" w:w="1728"/>
+          </w:tcPr>
+          <w:p>
+            <w:r>
+              <w:t>9.51%</w:t>
+            </w:r>
+          </w:p>
+        </w:tc>
+        <w:tc>
+          <w:tcPr>
+            <w:tcW w:type="dxa" w:w="1728"/>
+          </w:tcPr>
+          <w:p>
+            <w:r>
+              <w:t>8.16%</w:t>
+            </w:r>
+          </w:p>
+        </w:tc>
+        <w:tc>
+          <w:tcPr>
+            <w:tcW w:type="dxa" w:w="1728"/>
+          </w:tcPr>
+          <w:p>
+            <w:r>
+              <w:t>4.76%</w:t>
+            </w:r>
+          </w:p>
+        </w:tc>
+        <w:tc>
+          <w:tcPr>
+            <w:tcW w:type="dxa" w:w="1728"/>
+          </w:tcPr>
+          <w:p>
+            <w:r>
+              <w:t>finance.yahoo.com/quote/T/holders</w:t>
+            </w:r>
+          </w:p>
+        </w:tc>
+      </w:tr>
+      <w:tr>
+        <w:tc>
+          <w:tcPr>
+            <w:tcW w:type="dxa" w:w="1728"/>
+          </w:tcPr>
+          <w:p>
+            <w:r>
+              <w:t>Walmart (WMT)</w:t>
+            </w:r>
+          </w:p>
+        </w:tc>
+        <w:tc>
+          <w:tcPr>
+            <w:tcW w:type="dxa" w:w="1728"/>
+          </w:tcPr>
+          <w:p>
+            <w:r>
+              <w:t>5.52%</w:t>
+            </w:r>
+          </w:p>
+        </w:tc>
+        <w:tc>
+          <w:tcPr>
+            <w:tcW w:type="dxa" w:w="1728"/>
+          </w:tcPr>
+          <w:p>
+            <w:r>
+              <w:t>4.38%</w:t>
+            </w:r>
+          </w:p>
+        </w:tc>
+        <w:tc>
+          <w:tcPr>
+            <w:tcW w:type="dxa" w:w="1728"/>
+          </w:tcPr>
+          <w:p>
+            <w:r>
+              <w:t>2.32%</w:t>
+            </w:r>
+          </w:p>
+        </w:tc>
+        <w:tc>
+          <w:tcPr>
+            <w:tcW w:type="dxa" w:w="1728"/>
+          </w:tcPr>
+          <w:p>
+            <w:r>
+              <w:t>finance.yahoo.com/quote/WMT/holders</w:t>
+            </w:r>
+          </w:p>
+        </w:tc>
+      </w:tr>
+      <w:tr>
+        <w:tc>
+          <w:tcPr>
+            <w:tcW w:type="dxa" w:w="1728"/>
+          </w:tcPr>
+          <w:p>
+            <w:r>
+              <w:t>Barclays (BCS ADR)</w:t>
+            </w:r>
+          </w:p>
+        </w:tc>
+        <w:tc>
+          <w:tcPr>
+            <w:tcW w:type="dxa" w:w="1728"/>
+          </w:tcPr>
+          <w:p>
+            <w:r>
+              <w:t>7.8%</w:t>
+            </w:r>
+          </w:p>
+        </w:tc>
+        <w:tc>
+          <w:tcPr>
+            <w:tcW w:type="dxa" w:w="1728"/>
+          </w:tcPr>
+          <w:p>
+            <w:r>
+              <w:t>6.5%</w:t>
+            </w:r>
+          </w:p>
+        </w:tc>
+        <w:tc>
+          <w:tcPr>
+            <w:tcW w:type="dxa" w:w="1728"/>
+          </w:tcPr>
+          <w:p>
+            <w:r>
+              <w:t>3.5%</w:t>
+            </w:r>
+          </w:p>
+        </w:tc>
+        <w:tc>
+          <w:tcPr>
+            <w:tcW w:type="dxa" w:w="1728"/>
+          </w:tcPr>
+          <w:p>
+            <w:r>
+              <w:t>finance.yahoo.com/quote/BCS/holders</w:t>
+            </w:r>
+          </w:p>
+        </w:tc>
+      </w:tr>
+      <w:tr>
+        <w:tc>
+          <w:tcPr>
+            <w:tcW w:type="dxa" w:w="1728"/>
+          </w:tcPr>
+          <w:p>
+            <w:r>
+              <w:t>USAA</w:t>
+            </w:r>
+          </w:p>
+        </w:tc>
+        <w:tc>
+          <w:tcPr>
+            <w:tcW w:type="dxa" w:w="1728"/>
+          </w:tcPr>
+          <w:p>
+            <w:r>
+              <w:t>N/A</w:t>
+            </w:r>
+          </w:p>
+        </w:tc>
+        <w:tc>
+          <w:tcPr>
+            <w:tcW w:type="dxa" w:w="1728"/>
+          </w:tcPr>
+          <w:p>
+            <w:r>
+              <w:t>N/A</w:t>
+            </w:r>
+          </w:p>
+        </w:tc>
+        <w:tc>
+          <w:tcPr>
+            <w:tcW w:type="dxa" w:w="1728"/>
+          </w:tcPr>
+          <w:p>
+            <w:r>
+              <w:t>N/A</w:t>
+            </w:r>
+          </w:p>
+        </w:tc>
+        <w:tc>
+          <w:tcPr>
+            <w:tcW w:type="dxa" w:w="1728"/>
+          </w:tcPr>
+          <w:p>
+            <w:r>
+              <w:t>Member-owned mutual — not publicly traded</w:t>
+            </w:r>
+          </w:p>
+        </w:tc>
+      </w:tr>
+    </w:tbl>
+    <w:p>
+      <w:r>
+        <w:rPr>
+          <w:b w:val="0"/>
+        </w:rPr>
+        <w:t>The Big Three own both the outsourcing firm (TCS) and every major end-client company receiving the workers. Labor cost savings flow to margins at every node — and the Big Three capture those margin improvements as index fund returns.</w:t>
+      </w:r>
+    </w:p>
+    <w:p>
+      <w:pPr>
+        <w:pStyle w:val="Heading2"/>
+      </w:pPr>
+      <w:r>
+        <w:t>09-C — FEDERAL CONTRACTS</w:t>
+      </w:r>
+    </w:p>
+    <w:tbl>
+      <w:tblPr>
+        <w:tblStyle w:val="TableGrid"/>
+        <w:tblW w:type="auto" w:w="0"/>
+        <w:tblLook w:firstColumn="1" w:firstRow="1" w:lastColumn="0" w:lastRow="0" w:noHBand="0" w:noVBand="1" w:val="04A0"/>
+      </w:tblPr>
+      <w:tblGrid>
+        <w:gridCol w:w="2160"/>
+        <w:gridCol w:w="2160"/>
+        <w:gridCol w:w="2160"/>
+        <w:gridCol w:w="2160"/>
+      </w:tblGrid>
+      <w:tr>
+        <w:tc>
+          <w:tcPr>
+            <w:tcW w:type="dxa" w:w="2160"/>
+          </w:tcPr>
+          <w:p>
+            <w:r>
+              <w:rPr>
+                <w:b/>
+              </w:rPr>
+              <w:t>Company</w:t>
+            </w:r>
+          </w:p>
+        </w:tc>
+        <w:tc>
+          <w:tcPr>
+            <w:tcW w:type="dxa" w:w="2160"/>
+          </w:tcPr>
+          <w:p>
+            <w:r>
+              <w:rPr>
+                <w:b/>
+              </w:rPr>
+              <w:t>Federal Contract Amount</w:t>
+            </w:r>
+          </w:p>
+        </w:tc>
+        <w:tc>
+          <w:tcPr>
+            <w:tcW w:type="dxa" w:w="2160"/>
+          </w:tcPr>
+          <w:p>
+            <w:r>
+              <w:rPr>
+                <w:b/>
+              </w:rPr>
+              <w:t>Notes</w:t>
+            </w:r>
+          </w:p>
+        </w:tc>
+        <w:tc>
+          <w:tcPr>
+            <w:tcW w:type="dxa" w:w="2160"/>
+          </w:tcPr>
+          <w:p>
+            <w:r>
+              <w:rPr>
+                <w:b/>
+              </w:rPr>
+              <w:t>Source</w:t>
+            </w:r>
+          </w:p>
+        </w:tc>
+      </w:tr>
+      <w:tr>
+        <w:tc>
+          <w:tcPr>
+            <w:tcW w:type="dxa" w:w="2160"/>
+          </w:tcPr>
+          <w:p>
+            <w:r>
+              <w:t>Amazon/AWS</w:t>
+            </w:r>
+          </w:p>
+        </w:tc>
+        <w:tc>
+          <w:tcPr>
+            <w:tcW w:type="dxa" w:w="2160"/>
+          </w:tcPr>
+          <w:p>
+            <w:r>
+              <w:t>~$798M cumulative FY2022–2025</w:t>
+            </w:r>
+          </w:p>
+        </w:tc>
+        <w:tc>
+          <w:tcPr>
+            <w:tcW w:type="dxa" w:w="2160"/>
+          </w:tcPr>
+          <w:p>
+            <w:r>
+              <w:t>Primarily cloud services</w:t>
+            </w:r>
+          </w:p>
+        </w:tc>
+        <w:tc>
+          <w:tcPr>
+            <w:tcW w:type="dxa" w:w="2160"/>
+          </w:tcPr>
+          <w:p>
+            <w:r>
+              <w:t>usaspending.gov</w:t>
+            </w:r>
+          </w:p>
+        </w:tc>
+      </w:tr>
+      <w:tr>
+        <w:tc>
+          <w:tcPr>
+            <w:tcW w:type="dxa" w:w="2160"/>
+          </w:tcPr>
+          <w:p>
+            <w:r>
+              <w:t>Microsoft</w:t>
+            </w:r>
+          </w:p>
+        </w:tc>
+        <w:tc>
+          <w:tcPr>
+            <w:tcW w:type="dxa" w:w="2160"/>
+          </w:tcPr>
+          <w:p>
+            <w:r>
+              <w:t>~$472–532M</w:t>
+            </w:r>
+          </w:p>
+        </w:tc>
+        <w:tc>
+          <w:tcPr>
+            <w:tcW w:type="dxa" w:w="2160"/>
+          </w:tcPr>
+          <w:p>
+            <w:r>
+              <w:t>Cloud/Azure/IT services</w:t>
+            </w:r>
+          </w:p>
+        </w:tc>
+        <w:tc>
+          <w:tcPr>
+            <w:tcW w:type="dxa" w:w="2160"/>
+          </w:tcPr>
+          <w:p>
+            <w:r>
+              <w:t>usaspending.gov/recipient/dd77b7c3-663e-cb91-229f-5766a50e9b7f-P/all</w:t>
+            </w:r>
+          </w:p>
+        </w:tc>
+      </w:tr>
+      <w:tr>
+        <w:tc>
+          <w:tcPr>
+            <w:tcW w:type="dxa" w:w="2160"/>
+          </w:tcPr>
+          <w:p>
+            <w:r>
+              <w:t>Google/Alphabet</w:t>
+            </w:r>
+          </w:p>
+        </w:tc>
+        <w:tc>
+          <w:tcPr>
+            <w:tcW w:type="dxa" w:w="2160"/>
+          </w:tcPr>
+          <w:p>
+            <w:r>
+              <w:t>Low tens of millions</w:t>
+            </w:r>
+          </w:p>
+        </w:tc>
+        <w:tc>
+          <w:tcPr>
+            <w:tcW w:type="dxa" w:w="2160"/>
+          </w:tcPr>
+          <w:p>
+            <w:r>
+              <w:t>Discount strategy; individual DoD awards $15.9M $13.2M $3.7M</w:t>
+            </w:r>
+          </w:p>
+        </w:tc>
+        <w:tc>
+          <w:tcPr>
+            <w:tcW w:type="dxa" w:w="2160"/>
+          </w:tcPr>
+          <w:p>
+            <w:r>
+              <w:t>usaspending.gov</w:t>
+            </w:r>
+          </w:p>
+        </w:tc>
+      </w:tr>
+      <w:tr>
+        <w:tc>
+          <w:tcPr>
+            <w:tcW w:type="dxa" w:w="2160"/>
+          </w:tcPr>
+          <w:p>
+            <w:r>
+              <w:t>Meta</w:t>
+            </w:r>
+          </w:p>
+        </w:tc>
+        <w:tc>
+          <w:tcPr>
+            <w:tcW w:type="dxa" w:w="2160"/>
+          </w:tcPr>
+          <w:p>
+            <w:r>
+              <w:t>Negligible (&lt;$50K tracked)</w:t>
+            </w:r>
+          </w:p>
+        </w:tc>
+        <w:tc>
+          <w:tcPr>
+            <w:tcW w:type="dxa" w:w="2160"/>
+          </w:tcPr>
+          <w:p>
+            <w:r>
+              <w:t>No significant federal contracting footprint</w:t>
+            </w:r>
+          </w:p>
+        </w:tc>
+        <w:tc>
+          <w:tcPr>
+            <w:tcW w:type="dxa" w:w="2160"/>
+          </w:tcPr>
+          <w:p>
+            <w:r>
+              <w:t>usaspending.gov</w:t>
+            </w:r>
+          </w:p>
+        </w:tc>
+      </w:tr>
+      <w:tr>
+        <w:tc>
+          <w:tcPr>
+            <w:tcW w:type="dxa" w:w="2160"/>
+          </w:tcPr>
+          <w:p>
+            <w:r>
+              <w:t>TCS</w:t>
+            </w:r>
+          </w:p>
+        </w:tc>
+        <w:tc>
+          <w:tcPr>
+            <w:tcW w:type="dxa" w:w="2160"/>
+          </w:tcPr>
+          <w:p>
+            <w:r>
+              <w:t>Scattered small contracts only</w:t>
+            </w:r>
+          </w:p>
+        </w:tc>
+        <w:tc>
+          <w:tcPr>
+            <w:tcW w:type="dxa" w:w="2160"/>
+          </w:tcPr>
+          <w:p>
+            <w:r>
+              <w:t>Low millions cumulative; no major aggregate</w:t>
+            </w:r>
+          </w:p>
+        </w:tc>
+        <w:tc>
+          <w:tcPr>
+            <w:tcW w:type="dxa" w:w="2160"/>
+          </w:tcPr>
+          <w:p>
+            <w:r>
+              <w:t>usaspending.gov</w:t>
+            </w:r>
+          </w:p>
+        </w:tc>
+      </w:tr>
+    </w:tbl>
+    <w:p>
+      <w:pPr>
+        <w:pStyle w:val="Heading2"/>
+      </w:pPr>
+      <w:r>
+        <w:t>09-D — STATE SUBSIDIES (GOOD JOBS FIRST)</w:t>
+      </w:r>
+    </w:p>
+    <w:tbl>
+      <w:tblPr>
+        <w:tblStyle w:val="TableGrid"/>
+        <w:tblW w:type="auto" w:w="0"/>
+        <w:tblLook w:firstColumn="1" w:firstRow="1" w:lastColumn="0" w:lastRow="0" w:noHBand="0" w:noVBand="1" w:val="04A0"/>
+      </w:tblPr>
+      <w:tblGrid>
+        <w:gridCol w:w="2160"/>
+        <w:gridCol w:w="2160"/>
+        <w:gridCol w:w="2160"/>
+        <w:gridCol w:w="2160"/>
+      </w:tblGrid>
+      <w:tr>
+        <w:tc>
+          <w:tcPr>
+            <w:tcW w:type="dxa" w:w="2160"/>
+          </w:tcPr>
+          <w:p>
+            <w:r>
+              <w:rPr>
+                <w:b/>
+              </w:rPr>
+              <w:t>Company</w:t>
+            </w:r>
+          </w:p>
+        </w:tc>
+        <w:tc>
+          <w:tcPr>
+            <w:tcW w:type="dxa" w:w="2160"/>
+          </w:tcPr>
+          <w:p>
+            <w:r>
+              <w:rPr>
+                <w:b/>
+              </w:rPr>
+              <w:t>Cumulative Subsidies</w:t>
+            </w:r>
+          </w:p>
+        </w:tc>
+        <w:tc>
+          <w:tcPr>
+            <w:tcW w:type="dxa" w:w="2160"/>
+          </w:tcPr>
+          <w:p>
+            <w:r>
+              <w:rPr>
+                <w:b/>
+              </w:rPr>
+              <w:t>Primary Mechanism</w:t>
+            </w:r>
+          </w:p>
+        </w:tc>
+        <w:tc>
+          <w:tcPr>
+            <w:tcW w:type="dxa" w:w="2160"/>
+          </w:tcPr>
+          <w:p>
+            <w:r>
+              <w:rPr>
+                <w:b/>
+              </w:rPr>
+              <w:t>Source</w:t>
+            </w:r>
+          </w:p>
+        </w:tc>
+      </w:tr>
+      <w:tr>
+        <w:tc>
+          <w:tcPr>
+            <w:tcW w:type="dxa" w:w="2160"/>
+          </w:tcPr>
+          <w:p>
+            <w:r>
+              <w:t>Amazon</w:t>
+            </w:r>
+          </w:p>
+        </w:tc>
+        <w:tc>
+          <w:tcPr>
+            <w:tcW w:type="dxa" w:w="2160"/>
+          </w:tcPr>
+          <w:p>
+            <w:r>
+              <w:t>$11.6B+ since ~2000</w:t>
+            </w:r>
+          </w:p>
+        </w:tc>
+        <w:tc>
+          <w:tcPr>
+            <w:tcW w:type="dxa" w:w="2160"/>
+          </w:tcPr>
+          <w:p>
+            <w:r>
+              <w:t>Warehouses, data centers, HQ — property tax abatements, sales tax exemptions, job credits</w:t>
+            </w:r>
+          </w:p>
+        </w:tc>
+        <w:tc>
+          <w:tcPr>
+            <w:tcW w:type="dxa" w:w="2160"/>
+          </w:tcPr>
+          <w:p>
+            <w:r>
+              <w:t>goodjobsfirst.org/amazon-tracker</w:t>
+            </w:r>
+          </w:p>
+        </w:tc>
+      </w:tr>
+      <w:tr>
+        <w:tc>
+          <w:tcPr>
+            <w:tcW w:type="dxa" w:w="2160"/>
+          </w:tcPr>
+          <w:p>
+            <w:r>
+              <w:t>Google/Alphabet</w:t>
+            </w:r>
+          </w:p>
+        </w:tc>
+        <w:tc>
+          <w:tcPr>
+            <w:tcW w:type="dxa" w:w="2160"/>
+          </w:tcPr>
+          <w:p>
+            <w:r>
+              <w:t>$2.319B (131 awards)</w:t>
+            </w:r>
+          </w:p>
+        </w:tc>
+        <w:tc>
+          <w:tcPr>
+            <w:tcW w:type="dxa" w:w="2160"/>
+          </w:tcPr>
+          <w:p>
+            <w:r>
+              <w:t>Data centers — Oklahoma $917M, Oregon $533M, NC $256M</w:t>
+            </w:r>
+          </w:p>
+        </w:tc>
+        <w:tc>
+          <w:tcPr>
+            <w:tcW w:type="dxa" w:w="2160"/>
+          </w:tcPr>
+          <w:p>
+            <w:r>
+              <w:t>subsidytracker.goodjobsfirst.org/parent/alphabet-inc</w:t>
+            </w:r>
+          </w:p>
+        </w:tc>
+      </w:tr>
+      <w:tr>
+        <w:tc>
+          <w:tcPr>
+            <w:tcW w:type="dxa" w:w="2160"/>
+          </w:tcPr>
+          <w:p>
+            <w:r>
+              <w:t>Microsoft</w:t>
+            </w:r>
+          </w:p>
+        </w:tc>
+        <w:tc>
+          <w:tcPr>
+            <w:tcW w:type="dxa" w:w="2160"/>
+          </w:tcPr>
+          <w:p>
+            <w:r>
+              <w:t>$1.602B (100 awards) + $840M loans</w:t>
+            </w:r>
+          </w:p>
+        </w:tc>
+        <w:tc>
+          <w:tcPr>
+            <w:tcW w:type="dxa" w:w="2160"/>
+          </w:tcPr>
+          <w:p>
+            <w:r>
+              <w:t>Data centers — property tax abatements, sales/use tax exemptions</w:t>
+            </w:r>
+          </w:p>
+        </w:tc>
+        <w:tc>
+          <w:tcPr>
+            <w:tcW w:type="dxa" w:w="2160"/>
+          </w:tcPr>
+          <w:p>
+            <w:r>
+              <w:t>subsidytracker.goodjobsfirst.org/parent/microsoft</w:t>
+            </w:r>
+          </w:p>
+        </w:tc>
+      </w:tr>
+      <w:tr>
+        <w:tc>
+          <w:tcPr>
+            <w:tcW w:type="dxa" w:w="2160"/>
+          </w:tcPr>
+          <w:p>
+            <w:r>
+              <w:t>Meta</w:t>
+            </w:r>
+          </w:p>
+        </w:tc>
+        <w:tc>
+          <w:tcPr>
+            <w:tcW w:type="dxa" w:w="2160"/>
+          </w:tcPr>
+          <w:p>
+            <w:r>
+              <w:t>$60M+ tracked</w:t>
+            </w:r>
+          </w:p>
+        </w:tc>
+        <w:tc>
+          <w:tcPr>
+            <w:tcW w:type="dxa" w:w="2160"/>
+          </w:tcPr>
+          <w:p>
+            <w:r>
+              <w:t>Data centers — WA $31M, OR $28M, TX and LA 80% property tax breaks</w:t>
+            </w:r>
+          </w:p>
+        </w:tc>
+        <w:tc>
+          <w:tcPr>
+            <w:tcW w:type="dxa" w:w="2160"/>
+          </w:tcPr>
+          <w:p>
+            <w:r>
+              <w:t>subsidytracker.goodjobsfirst.org/parent/meta-platforms-inc</w:t>
+            </w:r>
+          </w:p>
+        </w:tc>
+      </w:tr>
+      <w:tr>
+        <w:tc>
+          <w:tcPr>
+            <w:tcW w:type="dxa" w:w="2160"/>
+          </w:tcPr>
+          <w:p>
+            <w:r>
+              <w:t>TCS</w:t>
+            </w:r>
+          </w:p>
+        </w:tc>
+        <w:tc>
+          <w:tcPr>
+            <w:tcW w:type="dxa" w:w="2160"/>
+          </w:tcPr>
+          <w:p>
+            <w:r>
+              <w:t>None identified</w:t>
+            </w:r>
+          </w:p>
+        </w:tc>
+        <w:tc>
+          <w:tcPr>
+            <w:tcW w:type="dxa" w:w="2160"/>
+          </w:tcPr>
+          <w:p>
+            <w:r>
+              <w:t>No material US state/local subsidies tracked</w:t>
+            </w:r>
+          </w:p>
+        </w:tc>
+        <w:tc>
+          <w:tcPr>
+            <w:tcW w:type="dxa" w:w="2160"/>
+          </w:tcPr>
+          <w:p>
+            <w:r>
+              <w:t>subsidytracker.goodjobsfirst.org/parent/tata-group</w:t>
+            </w:r>
+          </w:p>
+        </w:tc>
+      </w:tr>
+    </w:tbl>
+    <w:p>
+      <w:pPr>
+        <w:pStyle w:val="Heading2"/>
+      </w:pPr>
+      <w:r>
+        <w:t>09-E — FEDERAL TAX PAID 2025</w:t>
+      </w:r>
+    </w:p>
+    <w:p>
+      <w:r>
+        <w:rPr>
+          <w:b w:val="0"/>
+        </w:rPr>
+        <w:t>Big Tech group collectively paid ~4.9% effective federal rate on $315B US profits in 2025, avoiding an estimated $51B+ in federal taxes. Source: itep.org/trump-meta-tesla-alphabet-amazon-obbba-taxes</w:t>
+      </w:r>
+    </w:p>
+    <w:tbl>
+      <w:tblPr>
+        <w:tblStyle w:val="TableGrid"/>
+        <w:tblW w:type="auto" w:w="0"/>
+        <w:tblLook w:firstColumn="1" w:firstRow="1" w:lastColumn="0" w:lastRow="0" w:noHBand="0" w:noVBand="1" w:val="04A0"/>
+      </w:tblPr>
+      <w:tblGrid>
+        <w:gridCol w:w="2160"/>
+        <w:gridCol w:w="2160"/>
+        <w:gridCol w:w="2160"/>
+        <w:gridCol w:w="2160"/>
+      </w:tblGrid>
+      <w:tr>
+        <w:tc>
+          <w:tcPr>
+            <w:tcW w:type="dxa" w:w="2160"/>
+          </w:tcPr>
+          <w:p>
+            <w:r>
+              <w:rPr>
+                <w:b/>
+              </w:rPr>
+              <w:t>Company</w:t>
+            </w:r>
+          </w:p>
+        </w:tc>
+        <w:tc>
+          <w:tcPr>
+            <w:tcW w:type="dxa" w:w="2160"/>
+          </w:tcPr>
+          <w:p>
+            <w:r>
+              <w:rPr>
+                <w:b/>
+              </w:rPr>
+              <w:t>Federal Tax Paid</w:t>
+            </w:r>
+          </w:p>
+        </w:tc>
+        <w:tc>
+          <w:tcPr>
+            <w:tcW w:type="dxa" w:w="2160"/>
+          </w:tcPr>
+          <w:p>
+            <w:r>
+              <w:rPr>
+                <w:b/>
+              </w:rPr>
+              <w:t>Effective Rate</w:t>
+            </w:r>
+          </w:p>
+        </w:tc>
+        <w:tc>
+          <w:tcPr>
+            <w:tcW w:type="dxa" w:w="2160"/>
+          </w:tcPr>
+          <w:p>
+            <w:r>
+              <w:rPr>
+                <w:b/>
+              </w:rPr>
+              <w:t>Source</w:t>
+            </w:r>
+          </w:p>
+        </w:tc>
+      </w:tr>
+      <w:tr>
+        <w:tc>
+          <w:tcPr>
+            <w:tcW w:type="dxa" w:w="2160"/>
+          </w:tcPr>
+          <w:p>
+            <w:r>
+              <w:t>Microsoft</w:t>
+            </w:r>
+          </w:p>
+        </w:tc>
+        <w:tc>
+          <w:tcPr>
+            <w:tcW w:type="dxa" w:w="2160"/>
+          </w:tcPr>
+          <w:p>
+            <w:r>
+              <w:t>$21.795B provision</w:t>
+            </w:r>
+          </w:p>
+        </w:tc>
+        <w:tc>
+          <w:tcPr>
+            <w:tcW w:type="dxa" w:w="2160"/>
+          </w:tcPr>
+          <w:p>
+            <w:r>
+              <w:t>~18%</w:t>
+            </w:r>
+          </w:p>
+        </w:tc>
+        <w:tc>
+          <w:tcPr>
+            <w:tcW w:type="dxa" w:w="2160"/>
+          </w:tcPr>
+          <w:p>
+            <w:r>
+              <w:t>macrotrends.net/stocks/charts/MSFT/microsoft/total-provision-income-taxes</w:t>
+            </w:r>
+          </w:p>
+        </w:tc>
+      </w:tr>
+      <w:tr>
+        <w:tc>
+          <w:tcPr>
+            <w:tcW w:type="dxa" w:w="2160"/>
+          </w:tcPr>
+          <w:p>
+            <w:r>
+              <w:t>Google/Alphabet</w:t>
+            </w:r>
+          </w:p>
+        </w:tc>
+        <w:tc>
+          <w:tcPr>
+            <w:tcW w:type="dxa" w:w="2160"/>
+          </w:tcPr>
+          <w:p>
+            <w:r>
+              <w:t>$26.656B provision</w:t>
+            </w:r>
+          </w:p>
+        </w:tc>
+        <w:tc>
+          <w:tcPr>
+            <w:tcW w:type="dxa" w:w="2160"/>
+          </w:tcPr>
+          <w:p>
+            <w:r>
+              <w:t>Low teens</w:t>
+            </w:r>
+          </w:p>
+        </w:tc>
+        <w:tc>
+          <w:tcPr>
+            <w:tcW w:type="dxa" w:w="2160"/>
+          </w:tcPr>
+          <w:p>
+            <w:r>
+              <w:t>macrotrends.net/stocks/charts/GOOG/alphabet/total-provision-income-taxes</w:t>
+            </w:r>
+          </w:p>
+        </w:tc>
+      </w:tr>
+      <w:tr>
+        <w:tc>
+          <w:tcPr>
+            <w:tcW w:type="dxa" w:w="2160"/>
+          </w:tcPr>
+          <w:p>
+            <w:r>
+              <w:t>Amazon</w:t>
+            </w:r>
+          </w:p>
+        </w:tc>
+        <w:tc>
+          <w:tcPr>
+            <w:tcW w:type="dxa" w:w="2160"/>
+          </w:tcPr>
+          <w:p>
+            <w:r>
+              <w:t>$2.75–2.8B cash paid</w:t>
+            </w:r>
+          </w:p>
+        </w:tc>
+        <w:tc>
+          <w:tcPr>
+            <w:tcW w:type="dxa" w:w="2160"/>
+          </w:tcPr>
+          <w:p>
+            <w:r>
+              <w:t>Sharp drop from prior years</w:t>
+            </w:r>
+          </w:p>
+        </w:tc>
+        <w:tc>
+          <w:tcPr>
+            <w:tcW w:type="dxa" w:w="2160"/>
+          </w:tcPr>
+          <w:p>
+            <w:r>
+              <w:t>politico.com/news/2026/02/06/amazon-emerges-a-big-winner-from-gop-tax-cuts-00768985</w:t>
+            </w:r>
+          </w:p>
+        </w:tc>
+      </w:tr>
+      <w:tr>
+        <w:tc>
+          <w:tcPr>
+            <w:tcW w:type="dxa" w:w="2160"/>
+          </w:tcPr>
+          <w:p>
+            <w:r>
+              <w:t>Meta</w:t>
+            </w:r>
+          </w:p>
+        </w:tc>
+        <w:tc>
+          <w:tcPr>
+            <w:tcW w:type="dxa" w:w="2160"/>
+          </w:tcPr>
+          <w:p>
+            <w:r>
+              <w:t>~$2.8B cash paid</w:t>
+            </w:r>
+          </w:p>
+        </w:tc>
+        <w:tc>
+          <w:tcPr>
+            <w:tcW w:type="dxa" w:w="2160"/>
+          </w:tcPr>
+          <w:p>
+            <w:r>
+              <w:t>~3.5–3.6% on $79B US income — avoided ~$13.7B</w:t>
+            </w:r>
+          </w:p>
+        </w:tc>
+        <w:tc>
+          <w:tcPr>
+            <w:tcW w:type="dxa" w:w="2160"/>
+          </w:tcPr>
+          <w:p>
+            <w:r>
+              <w:t>itep.org/meta-tax-breaks-trump-mark-zuckerberg</w:t>
+            </w:r>
+          </w:p>
+        </w:tc>
+      </w:tr>
+      <w:tr>
+        <w:tc>
+          <w:tcPr>
+            <w:tcW w:type="dxa" w:w="2160"/>
+          </w:tcPr>
+          <w:p>
+            <w:r>
+              <w:t>TCS</w:t>
+            </w:r>
+          </w:p>
+        </w:tc>
+        <w:tc>
+          <w:tcPr>
+            <w:tcW w:type="dxa" w:w="2160"/>
+          </w:tcPr>
+          <w:p>
+            <w:r>
+              <w:t>Not broken out</w:t>
+            </w:r>
+          </w:p>
+        </w:tc>
+        <w:tc>
+          <w:tcPr>
+            <w:tcW w:type="dxa" w:w="2160"/>
+          </w:tcPr>
+          <w:p>
+            <w:r>
+              <w:t>~24.5% global effective rate</w:t>
+            </w:r>
+          </w:p>
+        </w:tc>
+        <w:tc>
+          <w:tcPr>
+            <w:tcW w:type="dxa" w:w="2160"/>
+          </w:tcPr>
+          <w:p>
+            <w:r>
+              <w:t>finbox.com/NSEI:TCS/explorer/effect_tax_rate</w:t>
+            </w:r>
+          </w:p>
+        </w:tc>
+      </w:tr>
+    </w:tbl>
+    <w:p>
+      <w:pPr>
+        <w:pStyle w:val="Heading2"/>
+      </w:pPr>
+      <w:r>
+        <w:t>09-F — LOBBYING SPEND 2025</w:t>
+      </w:r>
+    </w:p>
+    <w:tbl>
+      <w:tblPr>
+        <w:tblStyle w:val="TableGrid"/>
+        <w:tblW w:type="auto" w:w="0"/>
+        <w:tblLook w:firstColumn="1" w:firstRow="1" w:lastColumn="0" w:lastRow="0" w:noHBand="0" w:noVBand="1" w:val="04A0"/>
+      </w:tblPr>
+      <w:tblGrid>
+        <w:gridCol w:w="2880"/>
+        <w:gridCol w:w="2880"/>
+        <w:gridCol w:w="2880"/>
+      </w:tblGrid>
+      <w:tr>
+        <w:tc>
+          <w:tcPr>
+            <w:tcW w:type="dxa" w:w="2880"/>
+          </w:tcPr>
+          <w:p>
+            <w:r>
+              <w:rPr>
+                <w:b/>
+              </w:rPr>
+              <w:t>Company</w:t>
+            </w:r>
+          </w:p>
+        </w:tc>
+        <w:tc>
+          <w:tcPr>
+            <w:tcW w:type="dxa" w:w="2880"/>
+          </w:tcPr>
+          <w:p>
+            <w:r>
+              <w:rPr>
+                <w:b/>
+              </w:rPr>
+              <w:t>2025 Federal Lobbying</w:t>
+            </w:r>
+          </w:p>
+        </w:tc>
+        <w:tc>
+          <w:tcPr>
+            <w:tcW w:type="dxa" w:w="2880"/>
+          </w:tcPr>
+          <w:p>
+            <w:r>
+              <w:rPr>
+                <w:b/>
+              </w:rPr>
+              <w:t>Source</w:t>
+            </w:r>
+          </w:p>
+        </w:tc>
+      </w:tr>
+      <w:tr>
+        <w:tc>
+          <w:tcPr>
+            <w:tcW w:type="dxa" w:w="2880"/>
+          </w:tcPr>
+          <w:p>
+            <w:r>
+              <w:t>Meta</w:t>
+            </w:r>
+          </w:p>
+        </w:tc>
+        <w:tc>
+          <w:tcPr>
+            <w:tcW w:type="dxa" w:w="2880"/>
+          </w:tcPr>
+          <w:p>
+            <w:r>
+              <w:t>$26,290,000</w:t>
+            </w:r>
+          </w:p>
+        </w:tc>
+        <w:tc>
+          <w:tcPr>
+            <w:tcW w:type="dxa" w:w="2880"/>
+          </w:tcPr>
+          <w:p>
+            <w:r>
+              <w:t>opensecrets.org/federal-lobbying/clients/summary?id=D000033563</w:t>
+            </w:r>
+          </w:p>
+        </w:tc>
+      </w:tr>
+      <w:tr>
+        <w:tc>
+          <w:tcPr>
+            <w:tcW w:type="dxa" w:w="2880"/>
+          </w:tcPr>
+          <w:p>
+            <w:r>
+              <w:t>Amazon</w:t>
+            </w:r>
+          </w:p>
+        </w:tc>
+        <w:tc>
+          <w:tcPr>
+            <w:tcW w:type="dxa" w:w="2880"/>
+          </w:tcPr>
+          <w:p>
+            <w:r>
+              <w:t>$18,865,000</w:t>
+            </w:r>
+          </w:p>
+        </w:tc>
+        <w:tc>
+          <w:tcPr>
+            <w:tcW w:type="dxa" w:w="2880"/>
+          </w:tcPr>
+          <w:p>
+            <w:r>
+              <w:t>opensecrets.org/federal-lobbying/clients/summary?cycle=2025&amp;id=D000023883</w:t>
+            </w:r>
+          </w:p>
+        </w:tc>
+      </w:tr>
+      <w:tr>
+        <w:tc>
+          <w:tcPr>
+            <w:tcW w:type="dxa" w:w="2880"/>
+          </w:tcPr>
+          <w:p>
+            <w:r>
+              <w:t>Google/Alphabet</w:t>
+            </w:r>
+          </w:p>
+        </w:tc>
+        <w:tc>
+          <w:tcPr>
+            <w:tcW w:type="dxa" w:w="2880"/>
+          </w:tcPr>
+          <w:p>
+            <w:r>
+              <w:t>$16,540,000</w:t>
+            </w:r>
+          </w:p>
+        </w:tc>
+        <w:tc>
+          <w:tcPr>
+            <w:tcW w:type="dxa" w:w="2880"/>
+          </w:tcPr>
+          <w:p>
+            <w:r>
+              <w:t>opensecrets.org/federal-lobbying/clients/summary?id=D000067823</w:t>
+            </w:r>
+          </w:p>
+        </w:tc>
+      </w:tr>
+      <w:tr>
+        <w:tc>
+          <w:tcPr>
+            <w:tcW w:type="dxa" w:w="2880"/>
+          </w:tcPr>
+          <w:p>
+            <w:r>
+              <w:t>Microsoft</w:t>
+            </w:r>
+          </w:p>
+        </w:tc>
+        <w:tc>
+          <w:tcPr>
+            <w:tcW w:type="dxa" w:w="2880"/>
+          </w:tcPr>
+          <w:p>
+            <w:r>
+              <w:t>$10,105,000</w:t>
+            </w:r>
+          </w:p>
+        </w:tc>
+        <w:tc>
+          <w:tcPr>
+            <w:tcW w:type="dxa" w:w="2880"/>
+          </w:tcPr>
+          <w:p>
+            <w:r>
+              <w:t>opensecrets.org/federal-lobbying/clients/summary?id=D000000115</w:t>
+            </w:r>
+          </w:p>
+        </w:tc>
+      </w:tr>
+      <w:tr>
+        <w:tc>
+          <w:tcPr>
+            <w:tcW w:type="dxa" w:w="2880"/>
+          </w:tcPr>
+          <w:p>
+            <w:r>
+              <w:t>TCS/Tata Sons</w:t>
+            </w:r>
+          </w:p>
+        </w:tc>
+        <w:tc>
+          <w:tcPr>
+            <w:tcW w:type="dxa" w:w="2880"/>
+          </w:tcPr>
+          <w:p>
+            <w:r>
+              <w:t>$1,040,000 (2024)</w:t>
+            </w:r>
+          </w:p>
+        </w:tc>
+        <w:tc>
+          <w:tcPr>
+            <w:tcW w:type="dxa" w:w="2880"/>
+          </w:tcPr>
+          <w:p>
+            <w:r>
+              <w:t>opensecrets.org/orgs/tata-sons-ltd/summary?id=D000067061</w:t>
+            </w:r>
+          </w:p>
+        </w:tc>
+      </w:tr>
+    </w:tbl>
+    <w:p>
+      <w:r>
+        <w:rPr>
+          <w:b w:val="0"/>
+        </w:rPr>
+        <w:t>Total top 4 US tech sponsors: $71.8M in federal lobbying in 2025 alone.</w:t>
+      </w:r>
+    </w:p>
+    <w:p>
+      <w:pPr>
+        <w:pStyle w:val="Heading2"/>
+      </w:pPr>
+      <w:r>
+        <w:t>09-G — PAC CONTRIBUTIONS 2023–2024 CYCLE</w:t>
+      </w:r>
+    </w:p>
+    <w:tbl>
+      <w:tblPr>
+        <w:tblStyle w:val="TableGrid"/>
+        <w:tblW w:type="auto" w:w="0"/>
+        <w:tblLook w:firstColumn="1" w:firstRow="1" w:lastColumn="0" w:lastRow="0" w:noHBand="0" w:noVBand="1" w:val="04A0"/>
+      </w:tblPr>
+      <w:tblGrid>
+        <w:gridCol w:w="1728"/>
+        <w:gridCol w:w="1728"/>
+        <w:gridCol w:w="1728"/>
+        <w:gridCol w:w="1728"/>
+        <w:gridCol w:w="1728"/>
+      </w:tblGrid>
+      <w:tr>
+        <w:tc>
+          <w:tcPr>
+            <w:tcW w:type="dxa" w:w="1728"/>
+          </w:tcPr>
+          <w:p>
+            <w:r>
+              <w:rPr>
+                <w:b/>
+              </w:rPr>
+              <w:t>Company</w:t>
+            </w:r>
+          </w:p>
+        </w:tc>
+        <w:tc>
+          <w:tcPr>
+            <w:tcW w:type="dxa" w:w="1728"/>
+          </w:tcPr>
+          <w:p>
+            <w:r>
+              <w:rPr>
+                <w:b/>
+              </w:rPr>
+              <w:t>Total PAC</w:t>
+            </w:r>
+          </w:p>
+        </w:tc>
+        <w:tc>
+          <w:tcPr>
+            <w:tcW w:type="dxa" w:w="1728"/>
+          </w:tcPr>
+          <w:p>
+            <w:r>
+              <w:rPr>
+                <w:b/>
+              </w:rPr>
+              <w:t>Dem %</w:t>
+            </w:r>
+          </w:p>
+        </w:tc>
+        <w:tc>
+          <w:tcPr>
+            <w:tcW w:type="dxa" w:w="1728"/>
+          </w:tcPr>
+          <w:p>
+            <w:r>
+              <w:rPr>
+                <w:b/>
+              </w:rPr>
+              <w:t>Rep %</w:t>
+            </w:r>
+          </w:p>
+        </w:tc>
+        <w:tc>
+          <w:tcPr>
+            <w:tcW w:type="dxa" w:w="1728"/>
+          </w:tcPr>
+          <w:p>
+            <w:r>
+              <w:rPr>
+                <w:b/>
+              </w:rPr>
+              <w:t>Source</w:t>
+            </w:r>
+          </w:p>
+        </w:tc>
+      </w:tr>
+      <w:tr>
+        <w:tc>
+          <w:tcPr>
+            <w:tcW w:type="dxa" w:w="1728"/>
+          </w:tcPr>
+          <w:p>
+            <w:r>
+              <w:t>Amazon</w:t>
+            </w:r>
+          </w:p>
+        </w:tc>
+        <w:tc>
+          <w:tcPr>
+            <w:tcW w:type="dxa" w:w="1728"/>
+          </w:tcPr>
+          <w:p>
+            <w:r>
+              <w:t>$799,000</w:t>
+            </w:r>
+          </w:p>
+        </w:tc>
+        <w:tc>
+          <w:tcPr>
+            <w:tcW w:type="dxa" w:w="1728"/>
+          </w:tcPr>
+          <w:p>
+            <w:r>
+              <w:t>50.56%</w:t>
+            </w:r>
+          </w:p>
+        </w:tc>
+        <w:tc>
+          <w:tcPr>
+            <w:tcW w:type="dxa" w:w="1728"/>
+          </w:tcPr>
+          <w:p>
+            <w:r>
+              <w:t>49.44%</w:t>
+            </w:r>
+          </w:p>
+        </w:tc>
+        <w:tc>
+          <w:tcPr>
+            <w:tcW w:type="dxa" w:w="1728"/>
+          </w:tcPr>
+          <w:p>
+            <w:r>
+              <w:t>opensecrets.org/political-action-committees-pacs/amazon-com/C00360354/summary/2024</w:t>
+            </w:r>
+          </w:p>
+        </w:tc>
+      </w:tr>
+      <w:tr>
+        <w:tc>
+          <w:tcPr>
+            <w:tcW w:type="dxa" w:w="1728"/>
+          </w:tcPr>
+          <w:p>
+            <w:r>
+              <w:t>Microsoft</w:t>
+            </w:r>
+          </w:p>
+        </w:tc>
+        <w:tc>
+          <w:tcPr>
+            <w:tcW w:type="dxa" w:w="1728"/>
+          </w:tcPr>
+          <w:p>
+            <w:r>
+              <w:t>$800,500</w:t>
+            </w:r>
+          </w:p>
+        </w:tc>
+        <w:tc>
+          <w:tcPr>
+            <w:tcW w:type="dxa" w:w="1728"/>
+          </w:tcPr>
+          <w:p>
+            <w:r>
+              <w:t>45.16%</w:t>
+            </w:r>
+          </w:p>
+        </w:tc>
+        <w:tc>
+          <w:tcPr>
+            <w:tcW w:type="dxa" w:w="1728"/>
+          </w:tcPr>
+          <w:p>
+            <w:r>
+              <w:t>53.40%</w:t>
+            </w:r>
+          </w:p>
+        </w:tc>
+        <w:tc>
+          <w:tcPr>
+            <w:tcW w:type="dxa" w:w="1728"/>
+          </w:tcPr>
+          <w:p>
+            <w:r>
+              <w:t>opensecrets.org/political-action-committees-pacs/microsoft-corp/C00227546/summary/2024</w:t>
+            </w:r>
+          </w:p>
+        </w:tc>
+      </w:tr>
+      <w:tr>
+        <w:tc>
+          <w:tcPr>
+            <w:tcW w:type="dxa" w:w="1728"/>
+          </w:tcPr>
+          <w:p>
+            <w:r>
+              <w:t>Google</w:t>
+            </w:r>
+          </w:p>
+        </w:tc>
+        <w:tc>
+          <w:tcPr>
+            <w:tcW w:type="dxa" w:w="1728"/>
+          </w:tcPr>
+          <w:p>
+            <w:r>
+              <w:t>$737,066</w:t>
+            </w:r>
+          </w:p>
+        </w:tc>
+        <w:tc>
+          <w:tcPr>
+            <w:tcW w:type="dxa" w:w="1728"/>
+          </w:tcPr>
+          <w:p>
+            <w:r>
+              <w:t>48.51%</w:t>
+            </w:r>
+          </w:p>
+        </w:tc>
+        <w:tc>
+          <w:tcPr>
+            <w:tcW w:type="dxa" w:w="1728"/>
+          </w:tcPr>
+          <w:p>
+            <w:r>
+              <w:t>50.47%</w:t>
+            </w:r>
+          </w:p>
+        </w:tc>
+        <w:tc>
+          <w:tcPr>
+            <w:tcW w:type="dxa" w:w="1728"/>
+          </w:tcPr>
+          <w:p>
+            <w:r>
+              <w:t>opensecrets.org/political-action-committees-pacs/google-inc/C00428623/summary/2024</w:t>
+            </w:r>
+          </w:p>
+        </w:tc>
+      </w:tr>
+      <w:tr>
+        <w:tc>
+          <w:tcPr>
+            <w:tcW w:type="dxa" w:w="1728"/>
+          </w:tcPr>
+          <w:p>
+            <w:r>
+              <w:t>Meta</w:t>
+            </w:r>
+          </w:p>
+        </w:tc>
+        <w:tc>
+          <w:tcPr>
+            <w:tcW w:type="dxa" w:w="1728"/>
+          </w:tcPr>
+          <w:p>
+            <w:r>
+              <w:t>$197,300</w:t>
+            </w:r>
+          </w:p>
+        </w:tc>
+        <w:tc>
+          <w:tcPr>
+            <w:tcW w:type="dxa" w:w="1728"/>
+          </w:tcPr>
+          <w:p>
+            <w:r>
+              <w:t>40%</w:t>
+            </w:r>
+          </w:p>
+        </w:tc>
+        <w:tc>
+          <w:tcPr>
+            <w:tcW w:type="dxa" w:w="1728"/>
+          </w:tcPr>
+          <w:p>
+            <w:r>
+              <w:t>57%</w:t>
+            </w:r>
+          </w:p>
+        </w:tc>
+        <w:tc>
+          <w:tcPr>
+            <w:tcW w:type="dxa" w:w="1728"/>
+          </w:tcPr>
+          <w:p>
+            <w:r>
+              <w:t>opensecrets.org/political-action-committees-pacs/meta/C00502906/summary/2024</w:t>
+            </w:r>
+          </w:p>
+        </w:tc>
+      </w:tr>
+      <w:tr>
+        <w:tc>
+          <w:tcPr>
+            <w:tcW w:type="dxa" w:w="1728"/>
+          </w:tcPr>
+          <w:p>
+            <w:r>
+              <w:t>TCS</w:t>
+            </w:r>
+          </w:p>
+        </w:tc>
+        <w:tc>
+          <w:tcPr>
+            <w:tcW w:type="dxa" w:w="1728"/>
+          </w:tcPr>
+          <w:p>
+            <w:r>
+              <w:t>None</w:t>
+            </w:r>
+          </w:p>
+        </w:tc>
+        <w:tc>
+          <w:tcPr>
+            <w:tcW w:type="dxa" w:w="1728"/>
+          </w:tcPr>
+          <w:p>
+            <w:r>
+              <w:t>N/A</w:t>
+            </w:r>
+          </w:p>
+        </w:tc>
+        <w:tc>
+          <w:tcPr>
+            <w:tcW w:type="dxa" w:w="1728"/>
+          </w:tcPr>
+          <w:p>
+            <w:r>
+              <w:t>N/A</w:t>
+            </w:r>
+          </w:p>
+        </w:tc>
+        <w:tc>
+          <w:tcPr>
+            <w:tcW w:type="dxa" w:w="1728"/>
+          </w:tcPr>
+          <w:p>
+            <w:r>
+              <w:t>No corporate PAC registered</w:t>
+            </w:r>
+          </w:p>
+        </w:tc>
+      </w:tr>
+    </w:tbl>
+    <w:p>
+      <w:r>
+        <w:rPr>
+          <w:b w:val="0"/>
+        </w:rPr>
+        <w:t>All four US tech sponsors split PAC contributions near 50/50. Bipartisan access strategy — no dominant party alignment. Reinforces Phase 6 political flip argument: same companies fund both sides simultaneously.</w:t>
+      </w:r>
+    </w:p>
+    <w:p>
+      <w:pPr>
+        <w:pStyle w:val="Heading2"/>
+      </w:pPr>
+      <w:r>
+        <w:t>09-H — 2025 TRUMP INAUGURAL DONATIONS</w:t>
+      </w:r>
+    </w:p>
+    <w:p>
+      <w:r>
+        <w:rPr>
+          <w:b w:val="0"/>
+        </w:rPr>
+        <w:t>All four major H-1B sponsors donated $1M each to the Trump 2025 inaugural committee simultaneously — buying access to the administration overseeing H-1B policy during active regulatory uncertainty ($100K fee, new wage rules, lottery changes all pending). Inaugural committees have no contribution limits — corporations can donate directly unlike campaign finance.</w:t>
+      </w:r>
+    </w:p>
+    <w:tbl>
+      <w:tblPr>
+        <w:tblStyle w:val="TableGrid"/>
+        <w:tblW w:type="auto" w:w="0"/>
+        <w:tblLook w:firstColumn="1" w:firstRow="1" w:lastColumn="0" w:lastRow="0" w:noHBand="0" w:noVBand="1" w:val="04A0"/>
+      </w:tblPr>
+      <w:tblGrid>
+        <w:gridCol w:w="2880"/>
+        <w:gridCol w:w="2880"/>
+        <w:gridCol w:w="2880"/>
+      </w:tblGrid>
+      <w:tr>
+        <w:tc>
+          <w:tcPr>
+            <w:tcW w:type="dxa" w:w="2880"/>
+          </w:tcPr>
+          <w:p>
+            <w:r>
+              <w:rPr>
+                <w:b/>
+              </w:rPr>
+              <w:t>Company</w:t>
+            </w:r>
+          </w:p>
+        </w:tc>
+        <w:tc>
+          <w:tcPr>
+            <w:tcW w:type="dxa" w:w="2880"/>
+          </w:tcPr>
+          <w:p>
+            <w:r>
+              <w:rPr>
+                <w:b/>
+              </w:rPr>
+              <w:t>Amount</w:t>
+            </w:r>
+          </w:p>
+        </w:tc>
+        <w:tc>
+          <w:tcPr>
+            <w:tcW w:type="dxa" w:w="2880"/>
+          </w:tcPr>
+          <w:p>
+            <w:r>
+              <w:rPr>
+                <w:b/>
+              </w:rPr>
+              <w:t>Source</w:t>
+            </w:r>
+          </w:p>
+        </w:tc>
+      </w:tr>
+      <w:tr>
+        <w:tc>
+          <w:tcPr>
+            <w:tcW w:type="dxa" w:w="2880"/>
+          </w:tcPr>
+          <w:p>
+            <w:r>
+              <w:t>Amazon</w:t>
+            </w:r>
+          </w:p>
+        </w:tc>
+        <w:tc>
+          <w:tcPr>
+            <w:tcW w:type="dxa" w:w="2880"/>
+          </w:tcPr>
+          <w:p>
+            <w:r>
+              <w:t>$1,000,000 cash + $1M in-kind Prime Video streaming</w:t>
+            </w:r>
+          </w:p>
+        </w:tc>
+        <w:tc>
+          <w:tcPr>
+            <w:tcW w:type="dxa" w:w="2880"/>
+          </w:tcPr>
+          <w:p>
+            <w:r>
+              <w:t>theguardian.com/technology/2024/dec/13/amazon-donation-trump-inauguration</w:t>
+            </w:r>
+          </w:p>
+        </w:tc>
+      </w:tr>
+      <w:tr>
+        <w:tc>
+          <w:tcPr>
+            <w:tcW w:type="dxa" w:w="2880"/>
+          </w:tcPr>
+          <w:p>
+            <w:r>
+              <w:t>Meta</w:t>
+            </w:r>
+          </w:p>
+        </w:tc>
+        <w:tc>
+          <w:tcPr>
+            <w:tcW w:type="dxa" w:w="2880"/>
+          </w:tcPr>
+          <w:p>
+            <w:r>
+              <w:t>$1,000,000 cash</w:t>
+            </w:r>
+          </w:p>
+        </w:tc>
+        <w:tc>
+          <w:tcPr>
+            <w:tcW w:type="dxa" w:w="2880"/>
+          </w:tcPr>
+          <w:p>
+            <w:r>
+              <w:t>cnbc.com/2025/04/23/trump-inauguration-donors-include-meta-amazon-target-delta-ford.html</w:t>
+            </w:r>
+          </w:p>
+        </w:tc>
+      </w:tr>
+      <w:tr>
+        <w:tc>
+          <w:tcPr>
+            <w:tcW w:type="dxa" w:w="2880"/>
+          </w:tcPr>
+          <w:p>
+            <w:r>
+              <w:t>Microsoft</w:t>
+            </w:r>
+          </w:p>
+        </w:tc>
+        <w:tc>
+          <w:tcPr>
+            <w:tcW w:type="dxa" w:w="2880"/>
+          </w:tcPr>
+          <w:p>
+            <w:r>
+              <w:t>$1,000,000 cash</w:t>
+            </w:r>
+          </w:p>
+        </w:tc>
+        <w:tc>
+          <w:tcPr>
+            <w:tcW w:type="dxa" w:w="2880"/>
+          </w:tcPr>
+          <w:p>
+            <w:r>
+              <w:t>theguardian.com/technology/2025/jan/09/google-microsoft-donate-trump-inaugural-fund</w:t>
+            </w:r>
+          </w:p>
+        </w:tc>
+      </w:tr>
+      <w:tr>
+        <w:tc>
+          <w:tcPr>
+            <w:tcW w:type="dxa" w:w="2880"/>
+          </w:tcPr>
+          <w:p>
+            <w:r>
+              <w:t>Google</w:t>
+            </w:r>
+          </w:p>
+        </w:tc>
+        <w:tc>
+          <w:tcPr>
+            <w:tcW w:type="dxa" w:w="2880"/>
+          </w:tcPr>
+          <w:p>
+            <w:r>
+              <w:t>$1,000,000 cash</w:t>
+            </w:r>
+          </w:p>
+        </w:tc>
+        <w:tc>
+          <w:tcPr>
+            <w:tcW w:type="dxa" w:w="2880"/>
+          </w:tcPr>
+          <w:p>
+            <w:r>
+              <w:t>cnbc.com/2025/01/09/google-donates-1-million-to-trumps-inauguration-fund.html</w:t>
+            </w:r>
+          </w:p>
+        </w:tc>
+      </w:tr>
+      <w:tr>
+        <w:tc>
+          <w:tcPr>
+            <w:tcW w:type="dxa" w:w="2880"/>
+          </w:tcPr>
+          <w:p>
+            <w:r>
+              <w:t>TCS</w:t>
+            </w:r>
+          </w:p>
+        </w:tc>
+        <w:tc>
+          <w:tcPr>
+            <w:tcW w:type="dxa" w:w="2880"/>
+          </w:tcPr>
+          <w:p>
+            <w:r>
+              <w:t>None identified</w:t>
+            </w:r>
+          </w:p>
+        </w:tc>
+        <w:tc>
+          <w:tcPr>
+            <w:tcW w:type="dxa" w:w="2880"/>
+          </w:tcPr>
+          <w:p>
+            <w:r>
+              <w:t>washingtonpost.com/politics/interactive/2025/trump-inauguration-donors-list</w:t>
+            </w:r>
+          </w:p>
+        </w:tc>
+      </w:tr>
+    </w:tbl>
+    <w:p>
+      <w:pPr>
+        <w:pStyle w:val="Heading2"/>
+      </w:pPr>
+      <w:r>
+        <w:t>09-I — H-1B APPROVALS VS. LAYOFFS</w:t>
+      </w:r>
+    </w:p>
+    <w:tbl>
+      <w:tblPr>
+        <w:tblStyle w:val="TableGrid"/>
+        <w:tblW w:type="auto" w:w="0"/>
+        <w:tblLook w:firstColumn="1" w:firstRow="1" w:lastColumn="0" w:lastRow="0" w:noHBand="0" w:noVBand="1" w:val="04A0"/>
+      </w:tblPr>
+      <w:tblGrid>
+        <w:gridCol w:w="2160"/>
+        <w:gridCol w:w="2160"/>
+        <w:gridCol w:w="2160"/>
+        <w:gridCol w:w="2160"/>
+      </w:tblGrid>
+      <w:tr>
+        <w:tc>
+          <w:tcPr>
+            <w:tcW w:type="dxa" w:w="2160"/>
+          </w:tcPr>
+          <w:p>
+            <w:r>
+              <w:rPr>
+                <w:b/>
+              </w:rPr>
+              <w:t>Company</w:t>
+            </w:r>
+          </w:p>
+        </w:tc>
+        <w:tc>
+          <w:tcPr>
+            <w:tcW w:type="dxa" w:w="2160"/>
+          </w:tcPr>
+          <w:p>
+            <w:r>
+              <w:rPr>
+                <w:b/>
+              </w:rPr>
+              <w:t>H-1B New Approvals FY2025</w:t>
+            </w:r>
+          </w:p>
+        </w:tc>
+        <w:tc>
+          <w:tcPr>
+            <w:tcW w:type="dxa" w:w="2160"/>
+          </w:tcPr>
+          <w:p>
+            <w:r>
+              <w:rPr>
+                <w:b/>
+              </w:rPr>
+              <w:t>Layoffs Same Period</w:t>
+            </w:r>
+          </w:p>
+        </w:tc>
+        <w:tc>
+          <w:tcPr>
+            <w:tcW w:type="dxa" w:w="2160"/>
+          </w:tcPr>
+          <w:p>
+            <w:r>
+              <w:rPr>
+                <w:b/>
+              </w:rPr>
+              <w:t>Pattern</w:t>
+            </w:r>
+          </w:p>
+        </w:tc>
+      </w:tr>
+      <w:tr>
+        <w:tc>
+          <w:tcPr>
+            <w:tcW w:type="dxa" w:w="2160"/>
+          </w:tcPr>
+          <w:p>
+            <w:r>
+              <w:t>Amazon</w:t>
+            </w:r>
+          </w:p>
+        </w:tc>
+        <w:tc>
+          <w:tcPr>
+            <w:tcW w:type="dxa" w:w="2160"/>
+          </w:tcPr>
+          <w:p>
+            <w:r>
+              <w:t>4,644</w:t>
+            </w:r>
+          </w:p>
+        </w:tc>
+        <w:tc>
+          <w:tcPr>
+            <w:tcW w:type="dxa" w:w="2160"/>
+          </w:tcPr>
+          <w:p>
+            <w:r>
+              <w:t>~30,000 corporate cuts Oct 2025 + Jan 2026</w:t>
+            </w:r>
+          </w:p>
+        </w:tc>
+        <w:tc>
+          <w:tcPr>
+            <w:tcW w:type="dxa" w:w="2160"/>
+          </w:tcPr>
+          <w:p>
+            <w:r>
+              <w:t>H-1B up 20% during largest-ever workforce reduction</w:t>
+            </w:r>
+          </w:p>
+        </w:tc>
+      </w:tr>
+      <w:tr>
+        <w:tc>
+          <w:tcPr>
+            <w:tcW w:type="dxa" w:w="2160"/>
+          </w:tcPr>
+          <w:p>
+            <w:r>
+              <w:t>Meta</w:t>
+            </w:r>
+          </w:p>
+        </w:tc>
+        <w:tc>
+          <w:tcPr>
+            <w:tcW w:type="dxa" w:w="2160"/>
+          </w:tcPr>
+          <w:p>
+            <w:r>
+              <w:t>1,555 (+112% vs FY2023)</w:t>
+            </w:r>
+          </w:p>
+        </w:tc>
+        <w:tc>
+          <w:tcPr>
+            <w:tcW w:type="dxa" w:w="2160"/>
+          </w:tcPr>
+          <w:p>
+            <w:r>
+              <w:t>~21,000 (2022–2023) + 8,000 planned May 2026</w:t>
+            </w:r>
+          </w:p>
+        </w:tc>
+        <w:tc>
+          <w:tcPr>
+            <w:tcW w:type="dxa" w:w="2160"/>
+          </w:tcPr>
+          <w:p>
+            <w:r>
+              <w:t>H-1B doubled during year of efficiency cuts</w:t>
+            </w:r>
+          </w:p>
+        </w:tc>
+      </w:tr>
+      <w:tr>
+        <w:tc>
+          <w:tcPr>
+            <w:tcW w:type="dxa" w:w="2160"/>
+          </w:tcPr>
+          <w:p>
+            <w:r>
+              <w:t>Microsoft</w:t>
+            </w:r>
+          </w:p>
+        </w:tc>
+        <w:tc>
+          <w:tcPr>
+            <w:tcW w:type="dxa" w:w="2160"/>
+          </w:tcPr>
+          <w:p>
+            <w:r>
+              <w:t>1,394</w:t>
+            </w:r>
+          </w:p>
+        </w:tc>
+        <w:tc>
+          <w:tcPr>
+            <w:tcW w:type="dxa" w:w="2160"/>
+          </w:tcPr>
+          <w:p>
+            <w:r>
+              <w:t>~15,000 (6,000 May + 9,000 July 2025)</w:t>
+            </w:r>
+          </w:p>
+        </w:tc>
+        <w:tc>
+          <w:tcPr>
+            <w:tcW w:type="dxa" w:w="2160"/>
+          </w:tcPr>
+          <w:p>
+            <w:r>
+              <w:t>~1,400 new H-1B alongside 15,000 layoffs same year</w:t>
+            </w:r>
+          </w:p>
+        </w:tc>
+      </w:tr>
+      <w:tr>
+        <w:tc>
+          <w:tcPr>
+            <w:tcW w:type="dxa" w:w="2160"/>
+          </w:tcPr>
+          <w:p>
+            <w:r>
+              <w:t>Google</w:t>
+            </w:r>
+          </w:p>
+        </w:tc>
+        <w:tc>
+          <w:tcPr>
+            <w:tcW w:type="dxa" w:w="2160"/>
+          </w:tcPr>
+          <w:p>
+            <w:r>
+              <w:t>1,050</w:t>
+            </w:r>
+          </w:p>
+        </w:tc>
+        <w:tc>
+          <w:tcPr>
+            <w:tcW w:type="dxa" w:w="2160"/>
+          </w:tcPr>
+          <w:p>
+            <w:r>
+              <w:t>Minimal — no major rounds 2023–2025</w:t>
+            </w:r>
+          </w:p>
+        </w:tc>
+        <w:tc>
+          <w:tcPr>
+            <w:tcW w:type="dxa" w:w="2160"/>
+          </w:tcPr>
+          <w:p>
+            <w:r>
+              <w:t>Consistent H-1B with no equivalent layoff pattern</w:t>
+            </w:r>
+          </w:p>
+        </w:tc>
+      </w:tr>
+      <w:tr>
+        <w:tc>
+          <w:tcPr>
+            <w:tcW w:type="dxa" w:w="2160"/>
+          </w:tcPr>
+          <w:p>
+            <w:r>
+              <w:t>TCS</w:t>
+            </w:r>
+          </w:p>
+        </w:tc>
+        <w:tc>
+          <w:tcPr>
+            <w:tcW w:type="dxa" w:w="2160"/>
+          </w:tcPr>
+          <w:p>
+            <w:r>
+              <w:t>846 (down 42% from FY2024)</w:t>
+            </w:r>
+          </w:p>
+        </w:tc>
+        <w:tc>
+          <w:tcPr>
+            <w:tcW w:type="dxa" w:w="2160"/>
+          </w:tcPr>
+          <w:p>
+            <w:r>
+              <w:t>No major US layoffs tracked</w:t>
+            </w:r>
+          </w:p>
+        </w:tc>
+        <w:tc>
+          <w:tcPr>
+            <w:tcW w:type="dxa" w:w="2160"/>
+          </w:tcPr>
+          <w:p>
+            <w:r>
+              <w:t>Shift away from outsourcing model</w:t>
+            </w:r>
+          </w:p>
+        </w:tc>
+      </w:tr>
+    </w:tbl>
+    <w:p>
+      <w:r>
+        <w:rPr>
+          <w:b w:val="0"/>
+        </w:rPr>
+        <w:t>Sources: cnbc.com/2026/01/28/amazon-layoffs-anti-bureaucracy-ai | reuters.com/world/meta-targets-may-20-first-wave-layoffs | cnbc.com/2025/07/02/microsoft-laying-off-about-9000-employees</w:t>
+      </w:r>
+    </w:p>
+    <w:p>
+      <w:pPr>
+        <w:pStyle w:val="Heading2"/>
+      </w:pPr>
+      <w:r>
+        <w:t>09-J — JOB TYPES FILLED BY H-1B</w:t>
+      </w:r>
+    </w:p>
+    <w:p>
+      <w:r>
+        <w:rPr>
+          <w:b w:val="0"/>
+        </w:rPr>
+        <w:t>Source: DOL OFLC LCA data FY2020–FY2026 via myvisajobs.com, h1bscope.com, h1bexposed.tech</w:t>
+      </w:r>
+    </w:p>
+    <w:p>
+      <w:r>
+        <w:rPr>
+          <w:b w:val="0"/>
+        </w:rPr>
+        <w:t>Amazon top roles: Software Development Engineer II (19,723), SDE I (13,183), SDE III (4,812), BI Engineer II (3,429). Education: 25.2% Bachelor, 71.2% Master, 3.6% Doctorate.</w:t>
+      </w:r>
+    </w:p>
+    <w:p>
+      <w:r>
+        <w:rPr>
+          <w:b w:val="0"/>
+        </w:rPr>
+        <w:t>Meta top roles: Software Engineer (15,629), Research Scientist (2,716), Data Scientist (2,188), Data Engineer (1,749). Education: 22.2% Bachelor, 71.4% Master, 6.4% Doctorate.</w:t>
+      </w:r>
+    </w:p>
+    <w:p>
+      <w:r>
+        <w:rPr>
+          <w:b w:val="0"/>
+        </w:rPr>
+        <w:t>Microsoft top roles: Software Engineering (9,542), Software Engineer (7,218), Product Management (806), Data Science (656). Education: 35.2% Bachelor, 61.3% Master, 3.5% Doctorate.</w:t>
+      </w:r>
+    </w:p>
+    <w:p>
+      <w:r>
+        <w:rPr>
+          <w:b w:val="0"/>
+        </w:rPr>
+        <w:t>Google top roles: Software Engineer (17,126), Program Manager (597), Product Manager (584), Research Scientist (437). Education: 25.2% Bachelor, 66.1% Master, 8.7% Doctorate.</w:t>
+      </w:r>
+    </w:p>
+    <w:p>
+      <w:r>
+        <w:rPr>
+          <w:b w:val="0"/>
+        </w:rPr>
+        <w:t>TCS top roles: Architect (10,291), Developer (4,030), Analyst (2,413), Technical Lead (1,368), System Administrator (812). Education: 85.2% Bachelor, 14.8% Master, 0.0% Doctorate.</w:t>
+      </w:r>
+    </w:p>
+    <w:p>
+      <w:r>
+        <w:rPr>
+          <w:b w:val="0"/>
+        </w:rPr>
+        <w:t>Important distinction: Direct employers (Amazon/Meta/Microsoft/Google) predominantly hire Master's holders in genuine specialty roles. Wage suppression operates through LCA level manipulation and reduced organizing capacity — not simple labor replacement. Outsourcing firms (TCS/Cognizant/Infosys) are Bachelor's-heavy with standardized implementation roles deployed to client sites. Cleaner displacement argument. More documented wage manipulation. Different mechanism, same program.</w:t>
+      </w:r>
+    </w:p>
+    <w:p>
+      <w:pPr>
+        <w:pStyle w:val="Heading2"/>
+      </w:pPr>
+      <w:r>
+        <w:t>09-K — THE TCS CONSULTING SCHEME</w:t>
+      </w:r>
+    </w:p>
+    <w:p>
+      <w:r>
+        <w:rPr>
+          <w:b w:val="0"/>
+        </w:rPr>
+        <w:t>TCS and similar outsourcing firms (Infosys, Cognizant, Wipro, HCL, Capgemini) sponsor H-1B visas but act as middlemen — deploying workers to third-party end-client companies under service contracts rather than employing them in-house. Workers perform routine IT implementation and support at client facilities, achieving 30–40% labor cost savings vs direct US hires.</w:t>
+      </w:r>
+    </w:p>
+    <w:p>
+      <w:r>
+        <w:rPr>
+          <w:b w:val="0"/>
+        </w:rPr>
+        <w:t>Documented end clients per Bloomberg 2025 investigation: Citigroup (largest — ~3,000 new H-1B contractors placed 2020–2024), Capital One, Verizon, AT&amp;T, Walmart, USAA, JPMorgan Chase, Wells Fargo, Goldman Sachs, Barclays, and broadly Fortune 500 corporations in financial services, telecom, insurance, retail, healthcare, and manufacturing.</w:t>
+      </w:r>
+    </w:p>
+    <w:p>
+      <w:r>
+        <w:rPr>
+          <w:b w:val="0"/>
+        </w:rPr>
+        <w:t>Sources: bloomberg.com/graphics/2025-h1b-visa-middlemen-cheap-labor-for-us-banks | redbus2us.com/top-20-clients-for-major-outsourcing-mncs-onsite-h1bs-dol-stats | epi.org/blog/new-data-infosys-tata-abuse-h-1b-program</w:t>
+      </w:r>
+    </w:p>
+    <w:p>
+      <w:pPr>
+        <w:pStyle w:val="Heading2"/>
+      </w:pPr>
+      <w:r>
+        <w:t>09-L — NARRATIVE INFRASTRUCTURE (PRO-EXPANSION THINK TANKS)</w:t>
+      </w:r>
+    </w:p>
+    <w:p>
+      <w:r>
+        <w:rPr>
+          <w:b w:val="0"/>
+        </w:rPr>
+        <w:t>The following organizations regularly analyze USCIS/DOL data and publish reports framing H-1B as economically beneficial. All are structured as 501(c)(3)s. Funding flows from tech-aligned foundations creating the same incentive loop: funders benefit from corporate visa model; research protects it.</w:t>
+      </w:r>
+    </w:p>
+    <w:p>
+      <w:r>
+        <w:rPr>
+          <w:b w:val="0"/>
+        </w:rPr>
+        <w:t>NFAP (National Foundation for American Policy) — Funded partly by FWD.us Education Fund (Zuckerberg immigration advocacy), Carnegie Corporation, ImpactAssets. ProPublica EIN 20-0094633: projects.propublica.org/nonprofits/organizations/200094633</w:t>
+      </w:r>
+    </w:p>
+    <w:p>
+      <w:r>
+        <w:rPr>
+          <w:b w:val="0"/>
+        </w:rPr>
+        <w:t>Migration Policy Institute — Carnegie Corporation $2M grant 2026 plus Annie E. Casey, Arnold Ventures. Funders page: migrationpolicy.org/about/funders</w:t>
+      </w:r>
+    </w:p>
+    <w:p>
+      <w:r>
+        <w:rPr>
+          <w:b w:val="0"/>
+        </w:rPr>
+        <w:t>Cato Institute — Koch network historically prominent; diversified free-market foundations. Primary H-1B voice: David Bier. cato.org/people/david-bier</w:t>
+      </w:r>
+    </w:p>
+    <w:p>
+      <w:r>
+        <w:rPr>
+          <w:b w:val="0"/>
+        </w:rPr>
+        <w:t>American Immigration Council — 501(c)(3) focused on immigration policy education. Pro-expansion fact sheets on H-1B and H-2 programs. americanimmigrationcouncil.org</w:t>
+      </w:r>
+    </w:p>
+    <w:p>
+      <w:r>
+        <w:rPr>
+          <w:b w:val="0"/>
+        </w:rPr>
+        <w:t>Economic Innovation Group (EIG) — 2026 report: H-1B households generate $30K+ net annual fiscal surplus. Tech and innovation funders. eig.org/fiscal-impacts-h1bs</w:t>
+      </w:r>
+    </w:p>
+    <w:p>
+      <w:r>
+        <w:rPr>
+          <w:b w:val="0"/>
+        </w:rPr>
+        <w:t>For H-2 programs: American Farm Bureau Federation, American Immigration Council, Cato Institute, National Council of Agricultural Employers, H-2B Workforce Coalition (AHLA/Edgeworth Economics commissioned studies claiming H-2B creates 3–5 local jobs per visa worker). Pattern identical to H-1B: same USCIS/DOL raw data interpreted to emphasize benefits.</w:t>
+      </w:r>
+    </w:p>
+    <w:p>
+      <w:pPr>
         <w:pStyle w:val="Heading1"/>
         <w:spacing w:after="120" w:before="400"/>
       </w:pPr>
@@ -10192,6 +13313,14 @@
         </w:pBdr>
         <w:spacing w:after="160" w:before="160"/>
       </w:pPr>
+    </w:p>
+    <w:p>
+      <w:r>
+        <w:rPr>
+          <w:b w:val="0"/>
+        </w:rPr>
+        <w:t>PHASE 4 STATUS UPDATE (April 2026): The following Phase 4 items are now COMPLETE and documented in Chapter 09 subsections A through L: Big Three ownership percentages for top H-1B sponsors (09-A); Big Three ownership of TCS end-client companies (09-B); Federal contract receipts per sponsor (09-C); State subsidies per sponsor (09-D); Federal tax paid per sponsor (09-E); Lobbying expenditures per sponsor (09-F); PAC contributions per sponsor (09-G); Trump inaugural donations (09-H); H-1B approvals vs layoff records (09-I); Job types filled per sponsor (09-J); TCS consulting/contractor scheme documentation (09-K); Narrative infrastructure documentation (09-L). REMAINING PHASE 4 GAPS: H-2 sponsor PE intermediary chain (KKR/Blackstone confirmation still pending). PHASE 6 research (vote records, donor tracking, legislator quotes, party platform language, Pew polling) remains outstanding.</w:t>
+      </w:r>
     </w:p>
     <w:p>
       <w:pPr>

</xml_diff>

<commit_message>
Add H-2B research to master research file: program size, wages, enforcement, sources
</commit_message>
<xml_diff>
--- a/reference/visa/Visa_Incentive_Machine_Master_Research.docx
+++ b/reference/visa/Visa_Incentive_Machine_Master_Research.docx
@@ -3288,6 +3288,123 @@
       </w:r>
     </w:p>
     <w:p>
+      <w:r>
+        <w:t>H-2B TRUE PROGRAM SIZE (FY2024 — CONFIRMED)</w:t>
+      </w:r>
+    </w:p>
+    <w:p>
+      <w:r>
+        <w:t>Statutory cap: 66,000 (set by Congress 1992, never raised by legislation)</w:t>
+      </w:r>
+    </w:p>
+    <w:p>
+      <w:r>
+        <w:t>Supplemental cap authority: DHS authorized to add up to 64,716 additional visas per year via annual appropriations riders — both parties have authorized this every year since FY2016</w:t>
+      </w:r>
+    </w:p>
+    <w:p>
+      <w:r>
+        <w:t>Total FY2024 cap: 130,716</w:t>
+      </w:r>
+    </w:p>
+    <w:p>
+      <w:r>
+        <w:t>Total H-2B workers actually employed FY2024: 169,177 — more than 2.5x the original statutory cap</w:t>
+      </w:r>
+    </w:p>
+    <w:p>
+      <w:r>
+        <w:t>Breakdown: 139,541 new visas + 4,580 extensions with same employer + 25,056 employer transfers</w:t>
+      </w:r>
+    </w:p>
+    <w:p>
+      <w:r>
+        <w:t>✓ SOURCE: EPI analysis of USCIS H-2B Employer Data Hub + U.S. State Department Nonimmigrant Visa Statistics — epi.org/310379 + uscis.gov/tools/reports-and-studies/h-2b-employer-data-hub</w:t>
+      </w:r>
+    </w:p>
+    <w:p/>
+    <w:p>
+      <w:r>
+        <w:t>H-2B JOB DURATION — TEMPORARY IN NAME ONLY (FY2024)</w:t>
+      </w:r>
+    </w:p>
+    <w:p>
+      <w:r>
+        <w:t>Average certified job duration: 232 days (7.6 months)</w:t>
+      </w:r>
+    </w:p>
+    <w:p>
+      <w:r>
+        <w:t>86% of jobs certified for 6 months or more</w:t>
+      </w:r>
+    </w:p>
+    <w:p>
+      <w:r>
+        <w:t>75% certified for 7 months or more</w:t>
+      </w:r>
+    </w:p>
+    <w:p>
+      <w:r>
+        <w:t>53% certified for 8 months or more</w:t>
+      </w:r>
+    </w:p>
+    <w:p>
+      <w:r>
+        <w:t>28% certified for 9 months or more — the legal maximum</w:t>
+      </w:r>
+    </w:p>
+    <w:p>
+      <w:r>
+        <w:t>Program legally defined as temporary. Over half the certified positions run 8+ months.</w:t>
+      </w:r>
+    </w:p>
+    <w:p>
+      <w:r>
+        <w:t>✓ SOURCE: DOL OFLC H-2B Performance Data FY2024 — dol.gov/agencies/eta/foreign-labor/performance</w:t>
+      </w:r>
+    </w:p>
+    <w:p/>
+    <w:p>
+      <w:r>
+        <w:t>H-2B OCCUPATION CONCENTRATION (FY2024)</w:t>
+      </w:r>
+    </w:p>
+    <w:p>
+      <w:r>
+        <w:t>Top-10 occupations account for 98.8% of all H-2B approvals — program is highly concentrated in low-wage industries with documented wage theft histories</w:t>
+      </w:r>
+    </w:p>
+    <w:p>
+      <w:r>
+        <w:t>#1 Building/grounds cleaning and maintenance (landscaping, maids, janitors): 93,349 approvals — 45.86%</w:t>
+      </w:r>
+    </w:p>
+    <w:p>
+      <w:r>
+        <w:t>#2 Food preparation and serving: 28,746 approvals — 14.12%</w:t>
+      </w:r>
+    </w:p>
+    <w:p>
+      <w:r>
+        <w:t>#3 Construction and extraction: 15,684 approvals — 7.70%</w:t>
+      </w:r>
+    </w:p>
+    <w:p>
+      <w:r>
+        <w:t>#4 Production occupations: 15,476 approvals — 7.60%</w:t>
+      </w:r>
+    </w:p>
+    <w:p>
+      <w:r>
+        <w:t>#5 Farming, fishing and forestry: 14,669 approvals — 7.21%</w:t>
+      </w:r>
+    </w:p>
+    <w:p>
+      <w:r>
+        <w:t>✓ SOURCE: EPI analysis of USCIS H-2B Employer Data Hub FY2024 — epi.org/310379</w:t>
+      </w:r>
+    </w:p>
+    <w:p>
       <w:pPr>
         <w:pStyle w:val="ListParagraph"/>
         <w:numPr>
@@ -4856,6 +4973,103 @@
       </w:r>
     </w:p>
     <w:p>
+      <w:r>
+        <w:t>H-2B CERTIFIED WAGES VS. NATIONAL STANDARDS — TOP OCCUPATIONS (FY2024)</w:t>
+      </w:r>
+    </w:p>
+    <w:p>
+      <w:r>
+        <w:t>In all top-15 H-2B occupations, certified wages were lower than OEWS national average for the occupation. The DOL uses OEWS data to set H-2B wages — making this an apples-to-apples comparison showing the program legally suppresses national wage standards.</w:t>
+      </w:r>
+    </w:p>
+    <w:p>
+      <w:r>
+        <w:t>Landscaping and groundskeeping (37% of all H-2B): H-2B avg $17.55/hr vs national avg $19.66/hr — 10.7% below</w:t>
+      </w:r>
+    </w:p>
+    <w:p>
+      <w:r>
+        <w:t>Forest and conservation workers: H-2B avg $15.51/hr vs national avg $20.59/hr — 24.7% below (largest gap)</w:t>
+      </w:r>
+    </w:p>
+    <w:p>
+      <w:r>
+        <w:t>Meat, poultry and fish cutters: H-2B avg $14.45/hr vs national avg $18.58/hr — 22.2% below</w:t>
+      </w:r>
+    </w:p>
+    <w:p>
+      <w:r>
+        <w:t>Construction laborers: H-2B avg $20.85/hr vs national avg $24.64/hr — 15.4% below</w:t>
+      </w:r>
+    </w:p>
+    <w:p>
+      <w:r>
+        <w:t>Cement masons: H-2B avg $23.66/hr vs national avg $28.54/hr — 17.1% below</w:t>
+      </w:r>
+    </w:p>
+    <w:p>
+      <w:r>
+        <w:t>Fast food and counter workers: H-2B avg $12.68/hr vs national avg $15.07/hr — 15.8% below</w:t>
+      </w:r>
+    </w:p>
+    <w:p>
+      <w:r>
+        <w:t>Packers and packagers: H-2B avg $14.85/hr vs national avg $17.59/hr — 15.6% below</w:t>
+      </w:r>
+    </w:p>
+    <w:p>
+      <w:r>
+        <w:t>✓ SOURCE: EPI analysis of BLS 2024 OEWS data + DOL OFLC H-2B Performance Data FY2024 — epi.org/310379</w:t>
+      </w:r>
+    </w:p>
+    <w:p/>
+    <w:p>
+      <w:r>
+        <w:t>EMPLOYER PRIVATE WAGE SURVEY LOOPHOLE</w:t>
+      </w:r>
+    </w:p>
+    <w:p>
+      <w:r>
+        <w:t>Employers can substitute their own private wage surveys to set H-2B minimum wages below even the local OEWS average. Seafood employers in particular use this loophole to pay workers significantly less than local or state averages require.</w:t>
+      </w:r>
+    </w:p>
+    <w:p>
+      <w:r>
+        <w:t>✓ SOURCE: EPI September 2025 — epi.org/310379</w:t>
+      </w:r>
+    </w:p>
+    <w:p/>
+    <w:p>
+      <w:r>
+        <w:t>MEATPACKING H-2B WAGES VS. INDUSTRY (FY2024)</w:t>
+      </w:r>
+    </w:p>
+    <w:p>
+      <w:r>
+        <w:t>Animal processing (meatpacking + poultry) employs roughly 560,000 people with combined payroll of nearly $30 billion. Foreign-born workers constitute 42.2% of the workforce.</w:t>
+      </w:r>
+    </w:p>
+    <w:p>
+      <w:r>
+        <w:t>Average hourly wages: All workers $23.88 / U.S.-born $26.20 / Foreign-born $20.69 / New H-2B certifications $16.66</w:t>
+      </w:r>
+    </w:p>
+    <w:p>
+      <w:r>
+        <w:t>U.S.-born meatpacking wages = 83.2% of typical U.S.-born economy-wide wages</w:t>
+      </w:r>
+    </w:p>
+    <w:p>
+      <w:r>
+        <w:t>H-2B certified meatpacking wages = $16.66/hr — below even the already-suppressed foreign-born industry average</w:t>
+      </w:r>
+    </w:p>
+    <w:p>
+      <w:r>
+        <w:t>✓ SOURCE: BLS Current Employment Statistics + Current Population Survey + DOL OFLC H-2B Performance Data FY2024 — epi.org/310379</w:t>
+      </w:r>
+    </w:p>
+    <w:p>
       <w:pPr>
         <w:pBdr>
           <w:bottom w:val="single" w:color="CCCCCC" w:sz="4" w:space="1"/>
@@ -5767,6 +5981,103 @@
           <w:szCs w:val="20"/>
         </w:rPr>
         <w:t xml:space="preserve">◆ CROSS-PROGRAM: Enforcement in both programs is collapsing relative to program scale: H-2A investigations have dropped 50% while certifications have nearly tripled; H-1B investigations are rising from a very low base but most violations remain unreported. In both cases, the enforcement architecture creates de facto impunity for abusive employers.</w:t>
+      </w:r>
+    </w:p>
+    <w:p>
+      <w:r>
+        <w:t>H-2B INDUSTRY WAGE THEFT — AGGREGATE FY2000–2024 (inflation-adjusted to 2024 dollars)</w:t>
+      </w:r>
+    </w:p>
+    <w:p>
+      <w:r>
+        <w:t>Source: DOL Wage and Hour Division, Industries with High Prevalence of H-2B Workers — enforcement covers ALL workers in these industries (U.S.-born, green card holders, H-2B workers, unauthorized workers), not H-2B workers exclusively. This means wage suppression from H-2B affects the entire industry workforce.</w:t>
+      </w:r>
+    </w:p>
+    <w:p>
+      <w:r>
+        <w:t>Total compliance actions FY2000–2024: 247,180</w:t>
+      </w:r>
+    </w:p>
+    <w:p>
+      <w:r>
+        <w:t>Total employees involved in violations: 2,021,557</w:t>
+      </w:r>
+    </w:p>
+    <w:p>
+      <w:r>
+        <w:t>Total employees assessed back wages owed: 1,822,164</w:t>
+      </w:r>
+    </w:p>
+    <w:p>
+      <w:r>
+        <w:t>Total back wages assessed: $2,238,327,967 (2024 dollars)</w:t>
+      </w:r>
+    </w:p>
+    <w:p>
+      <w:r>
+        <w:t>Average back wages owed per employee: $1,228</w:t>
+      </w:r>
+    </w:p>
+    <w:p>
+      <w:r>
+        <w:t>Total civil money penalties: $167,554,391</w:t>
+      </w:r>
+    </w:p>
+    <w:p>
+      <w:r>
+        <w:t>Average stolen per year: $89.5 million annually across 25 fiscal years</w:t>
+      </w:r>
+    </w:p>
+    <w:p>
+      <w:r>
+        <w:t>By industry: Construction $1,052,484,332 (avg $1,768/worker) / Food services $829,555,849 (avg $1,001/worker) / Janitorial $119,191,774 / Hotels and motels $105,638,105 / Landscaping $77,363,583 / Amusement $40,037,461 / Forestry $14,056,849</w:t>
+      </w:r>
+    </w:p>
+    <w:p>
+      <w:r>
+        <w:t>✓ SOURCE: DOL Wage and Hour Division, Industries with High Prevalence of H-2B Workers, FY2000–2024 — dol.gov/agencies/whd</w:t>
+      </w:r>
+    </w:p>
+    <w:p/>
+    <w:p>
+      <w:r>
+        <w:t>WHD ENFORCEMENT CAPACITY COLLAPSE (Updated 2025)</w:t>
+      </w:r>
+    </w:p>
+    <w:p>
+      <w:r>
+        <w:t>Only 611 WHD investigators as of May 2025 — policing a labor market of 170 million workers</w:t>
+      </w:r>
+    </w:p>
+    <w:p>
+      <w:r>
+        <w:t>✓ SOURCE: Workplace Justice Lab, Rutgers University, May 2025 — cited in EPI September 2025 report epi.org/310379</w:t>
+      </w:r>
+    </w:p>
+    <w:p/>
+    <w:p>
+      <w:r>
+        <w:t>MEATPACKING EMPLOYER STRATEGY — DOCUMENTED (1983–2024)</w:t>
+      </w:r>
+    </w:p>
+    <w:p>
+      <w:r>
+        <w:t>Historical pattern: As meatpacking unionization rates fell from 37.4% in 1983 to 13.5% in 2024, share of foreign-born workers rose to over 42%. This was an intentional employer strategy — aggressive recruitment of non-union immigrant labor to suppress worker bargaining power and wages.</w:t>
+      </w:r>
+    </w:p>
+    <w:p>
+      <w:r>
+        <w:t>Current lobbying: Meatpacking employers are actively lobbying Congress to change the law to allow H-2B for year-round jobs. Currently prohibited because H-2B requires temporary work and meatpacking is not seasonal. The push is to convert precarious unauthorized workforce into an even more controlled tethered-visa workforce.</w:t>
+      </w:r>
+    </w:p>
+    <w:p>
+      <w:r>
+        <w:t>This is the H-2 contractor layer mechanism extended into a new industry — visa dependency used to suppress wages and prevent organizing.</w:t>
+      </w:r>
+    </w:p>
+    <w:p>
+      <w:r>
+        <w:t>✓ SOURCE: EPI analysis of Current Population Survey microdata 1983–2024 + David Calamuci, Return to the Jungle, New Labor Forum 2008 — cited in epi.org/310379</w:t>
       </w:r>
     </w:p>
     <w:p>
@@ -12882,6 +13193,11 @@
       </w:r>
     </w:p>
     <w:p>
+      <w:r>
+        <w:t>H-2B RESEARCH SUBSTANTIALLY COMPLETE (September 2025 EPI Report): Program size, occupation concentration, job duration, wage suppression by occupation, wage theft aggregate by industry, WHD enforcement capacity, meatpacking employer strategy — all now documented from EPI September 2025 report (epi.org/310379) cross-referencing DOL OFLC, USCIS H-2B Employer Data Hub, BLS OEWS, and DOL WHD primary sources.</w:t>
+      </w:r>
+    </w:p>
+    <w:p>
       <w:pPr>
         <w:pStyle w:val="Heading2"/>
         <w:spacing w:after="80" w:before="280"/>
@@ -14010,6 +14326,26 @@
           <w:szCs w:val="20"/>
         </w:rPr>
         <w:t xml:space="preserve">EPI comment on 2025 IFR — epi.org/publication/epi-comment-on-dols-2025-interim-final-rule-modifying-the-aewr-methodology-for-h-2a-farmworkers/</w:t>
+      </w:r>
+    </w:p>
+    <w:p>
+      <w:r>
+        <w:t>EPI September 2025 H-2B Report (Costa and Bivens) — epi.org/310379 / files.epi.org/uploads/the-h-2-b-visa-program-has-ballooned-without-being-fixed.pdf</w:t>
+      </w:r>
+    </w:p>
+    <w:p>
+      <w:r>
+        <w:t>DOL WHD Industries with High Prevalence of H-2B Workers (FY2000–2024) — dol.gov/agencies/whd (wage theft enforcement data by industry)</w:t>
+      </w:r>
+    </w:p>
+    <w:p>
+      <w:r>
+        <w:t>Workplace Justice Lab, Rutgers University, May 2025 — WHD investigator count 611 (cited in EPI September 2025)</w:t>
+      </w:r>
+    </w:p>
+    <w:p>
+      <w:r>
+        <w:t>USCIS H-2B Employer Data Hub — uscis.gov/tools/reports-and-studies/h-2b-employer-data-hub</w:t>
       </w:r>
     </w:p>
     <w:p>

</xml_diff>